<commit_message>
fix: revisa tutorial de simulação do NRZ-L
</commit_message>
<xml_diff>
--- a/nrz_l/docs/tutorial_simulacao.docx
+++ b/nrz_l/docs/tutorial_simulacao.docx
@@ -354,21 +354,7 @@
         <w:rPr>
           <w:rFonts w:ascii="Arial" w:hAnsi="Arial" w:cs="Arial"/>
         </w:rPr>
-        <w:t xml:space="preserve">Para iniciar a simulação, é necessário que o </w:t>
-      </w:r>
-      <w:proofErr w:type="gramStart"/>
-      <w:r>
-        <w:rPr>
-          <w:rFonts w:ascii="Arial" w:hAnsi="Arial" w:cs="Arial"/>
-        </w:rPr>
-        <w:t>software Vivado</w:t>
-      </w:r>
-      <w:proofErr w:type="gramEnd"/>
-      <w:r>
-        <w:rPr>
-          <w:rFonts w:ascii="Arial" w:hAnsi="Arial" w:cs="Arial"/>
-        </w:rPr>
-        <w:t xml:space="preserve"> seja instalado, na versão 2025.2. Para obtê-lo, baixe o instalador por meio do </w:t>
+        <w:t xml:space="preserve">Para iniciar a simulação, é necessário que o software Vivado seja instalado, na versão 2025.2. Para obtê-lo, baixe o instalador por meio do </w:t>
       </w:r>
       <w:hyperlink r:id="rId8" w:history="1">
         <w:r>
@@ -415,7 +401,7 @@
     </w:p>
     <w:p>
       <w:pPr>
-        <w:pStyle w:val="ListParagraph"/>
+        <w:pStyle w:val="PargrafodaLista"/>
         <w:numPr>
           <w:ilvl w:val="0"/>
           <w:numId w:val="1"/>
@@ -458,7 +444,7 @@
     </w:p>
     <w:p>
       <w:pPr>
-        <w:pStyle w:val="ListParagraph"/>
+        <w:pStyle w:val="PargrafodaLista"/>
         <w:numPr>
           <w:ilvl w:val="0"/>
           <w:numId w:val="1"/>
@@ -477,7 +463,7 @@
     </w:p>
     <w:p>
       <w:pPr>
-        <w:pStyle w:val="ListParagraph"/>
+        <w:pStyle w:val="PargrafodaLista"/>
         <w:numPr>
           <w:ilvl w:val="0"/>
           <w:numId w:val="1"/>
@@ -712,6 +698,162 @@
         <w:rPr>
           <w:rFonts w:ascii="Arial" w:hAnsi="Arial" w:cs="Arial"/>
         </w:rPr>
+        <w:t>:</w:t>
+      </w:r>
+    </w:p>
+    <w:p>
+      <w:pPr>
+        <w:keepNext/>
+        <w:jc w:val="center"/>
+      </w:pPr>
+      <w:r>
+        <w:rPr>
+          <w:rFonts w:ascii="Arial" w:hAnsi="Arial" w:cs="Arial"/>
+        </w:rPr>
+        <w:drawing>
+          <wp:inline distT="0" distB="0" distL="0" distR="0" wp14:anchorId="5CC2F7C6" wp14:editId="70004238">
+            <wp:extent cx="4335780" cy="2787870"/>
+            <wp:effectExtent l="0" t="0" r="7620" b="0"/>
+            <wp:docPr id="1143411957" name="Imagem 1"/>
+            <wp:cNvGraphicFramePr>
+              <a:graphicFrameLocks xmlns:a="http://schemas.openxmlformats.org/drawingml/2006/main" noChangeAspect="1"/>
+            </wp:cNvGraphicFramePr>
+            <a:graphic xmlns:a="http://schemas.openxmlformats.org/drawingml/2006/main">
+              <a:graphicData uri="http://schemas.openxmlformats.org/drawingml/2006/picture">
+                <pic:pic xmlns:pic="http://schemas.openxmlformats.org/drawingml/2006/picture">
+                  <pic:nvPicPr>
+                    <pic:cNvPr id="1143411957" name=""/>
+                    <pic:cNvPicPr/>
+                  </pic:nvPicPr>
+                  <pic:blipFill>
+                    <a:blip r:embed="rId9"/>
+                    <a:stretch>
+                      <a:fillRect/>
+                    </a:stretch>
+                  </pic:blipFill>
+                  <pic:spPr>
+                    <a:xfrm>
+                      <a:off x="0" y="0"/>
+                      <a:ext cx="4341885" cy="2791795"/>
+                    </a:xfrm>
+                    <a:prstGeom prst="rect">
+                      <a:avLst/>
+                    </a:prstGeom>
+                  </pic:spPr>
+                </pic:pic>
+              </a:graphicData>
+            </a:graphic>
+          </wp:inline>
+        </w:drawing>
+      </w:r>
+    </w:p>
+    <w:p>
+      <w:pPr>
+        <w:pStyle w:val="Legenda"/>
+        <w:jc w:val="center"/>
+        <w:rPr>
+          <w:rFonts w:ascii="Arial" w:hAnsi="Arial" w:cs="Arial"/>
+        </w:rPr>
+      </w:pPr>
+      <w:r>
+        <w:t xml:space="preserve">Figura </w:t>
+      </w:r>
+      <w:fldSimple w:instr=" SEQ Figura \* ARABIC ">
+        <w:r>
+          <w:rPr>
+            <w:noProof/>
+          </w:rPr>
+          <w:t>1</w:t>
+        </w:r>
+      </w:fldSimple>
+      <w:r>
+        <w:t xml:space="preserve"> - Download do repositório no GitHub</w:t>
+      </w:r>
+    </w:p>
+    <w:p>
+      <w:pPr>
+        <w:ind w:firstLine="567"/>
+        <w:jc w:val="both"/>
+        <w:rPr>
+          <w:rFonts w:ascii="Arial" w:hAnsi="Arial" w:cs="Arial"/>
+        </w:rPr>
+      </w:pPr>
+      <w:r>
+        <w:rPr>
+          <w:rFonts w:ascii="Arial" w:hAnsi="Arial" w:cs="Arial"/>
+        </w:rPr>
+        <w:t>Em se</w:t>
+      </w:r>
+      <w:r>
+        <w:rPr>
+          <w:rFonts w:ascii="Arial" w:hAnsi="Arial" w:cs="Arial"/>
+        </w:rPr>
+        <w:t xml:space="preserve">guida, </w:t>
+      </w:r>
+      <w:r>
+        <w:rPr>
+          <w:rFonts w:ascii="Arial" w:hAnsi="Arial" w:cs="Arial"/>
+        </w:rPr>
+        <w:t>extra</w:t>
+      </w:r>
+      <w:r>
+        <w:rPr>
+          <w:rFonts w:ascii="Arial" w:hAnsi="Arial" w:cs="Arial"/>
+        </w:rPr>
+        <w:t>ia</w:t>
+      </w:r>
+      <w:r>
+        <w:rPr>
+          <w:rFonts w:ascii="Arial" w:hAnsi="Arial" w:cs="Arial"/>
+        </w:rPr>
+        <w:t xml:space="preserve"> o </w:t>
+      </w:r>
+      <w:r>
+        <w:rPr>
+          <w:rFonts w:ascii="Arial" w:hAnsi="Arial" w:cs="Arial"/>
+        </w:rPr>
+        <w:t>arquivo</w:t>
+      </w:r>
+      <w:r>
+        <w:rPr>
+          <w:rFonts w:ascii="Arial" w:hAnsi="Arial" w:cs="Arial"/>
+        </w:rPr>
+        <w:t xml:space="preserve"> em </w:t>
+      </w:r>
+      <w:r>
+        <w:rPr>
+          <w:rFonts w:ascii="Arial" w:hAnsi="Arial" w:cs="Arial"/>
+        </w:rPr>
+        <w:t>al</w:t>
+      </w:r>
+      <w:r>
+        <w:rPr>
+          <w:rFonts w:ascii="Arial" w:hAnsi="Arial" w:cs="Arial"/>
+        </w:rPr>
+        <w:t>guma past</w:t>
+      </w:r>
+      <w:r>
+        <w:rPr>
+          <w:rFonts w:ascii="Arial" w:hAnsi="Arial" w:cs="Arial"/>
+        </w:rPr>
+        <w:t xml:space="preserve">a </w:t>
+      </w:r>
+      <w:r>
+        <w:rPr>
+          <w:rFonts w:ascii="Arial" w:hAnsi="Arial" w:cs="Arial"/>
+        </w:rPr>
+        <w:t>de sua pref</w:t>
+      </w:r>
+      <w:r>
+        <w:rPr>
+          <w:rFonts w:ascii="Arial" w:hAnsi="Arial" w:cs="Arial"/>
+        </w:rPr>
+        <w:t>erência</w:t>
+      </w:r>
+      <w:r>
+        <w:rPr>
+          <w:rFonts w:ascii="Arial" w:hAnsi="Arial" w:cs="Arial"/>
+        </w:rPr>
         <w:t>.</w:t>
       </w:r>
       <w:r>
@@ -724,79 +866,49 @@
         <w:rPr>
           <w:rFonts w:ascii="Arial" w:hAnsi="Arial" w:cs="Arial"/>
         </w:rPr>
-        <w:t>Em se</w:t>
-      </w:r>
-      <w:r>
-        <w:rPr>
-          <w:rFonts w:ascii="Arial" w:hAnsi="Arial" w:cs="Arial"/>
-        </w:rPr>
-        <w:t xml:space="preserve">guida, </w:t>
-      </w:r>
-      <w:r>
-        <w:rPr>
-          <w:rFonts w:ascii="Arial" w:hAnsi="Arial" w:cs="Arial"/>
-        </w:rPr>
-        <w:t>extra</w:t>
-      </w:r>
-      <w:r>
-        <w:rPr>
-          <w:rFonts w:ascii="Arial" w:hAnsi="Arial" w:cs="Arial"/>
-        </w:rPr>
-        <w:t>ia</w:t>
-      </w:r>
-      <w:r>
-        <w:rPr>
-          <w:rFonts w:ascii="Arial" w:hAnsi="Arial" w:cs="Arial"/>
-        </w:rPr>
-        <w:t xml:space="preserve"> o </w:t>
-      </w:r>
-      <w:r>
-        <w:rPr>
-          <w:rFonts w:ascii="Arial" w:hAnsi="Arial" w:cs="Arial"/>
-        </w:rPr>
-        <w:t>arquivo</w:t>
-      </w:r>
-      <w:r>
-        <w:rPr>
-          <w:rFonts w:ascii="Arial" w:hAnsi="Arial" w:cs="Arial"/>
-        </w:rPr>
-        <w:t xml:space="preserve"> em </w:t>
-      </w:r>
-      <w:r>
-        <w:rPr>
-          <w:rFonts w:ascii="Arial" w:hAnsi="Arial" w:cs="Arial"/>
-        </w:rPr>
-        <w:t>al</w:t>
-      </w:r>
-      <w:r>
-        <w:rPr>
-          <w:rFonts w:ascii="Arial" w:hAnsi="Arial" w:cs="Arial"/>
-        </w:rPr>
-        <w:t>guma past</w:t>
-      </w:r>
-      <w:r>
-        <w:rPr>
-          <w:rFonts w:ascii="Arial" w:hAnsi="Arial" w:cs="Arial"/>
-        </w:rPr>
-        <w:t xml:space="preserve">a </w:t>
-      </w:r>
-      <w:r>
-        <w:rPr>
-          <w:rFonts w:ascii="Arial" w:hAnsi="Arial" w:cs="Arial"/>
-        </w:rPr>
-        <w:t>de sua pref</w:t>
-      </w:r>
-      <w:r>
-        <w:rPr>
-          <w:rFonts w:ascii="Arial" w:hAnsi="Arial" w:cs="Arial"/>
-        </w:rPr>
-        <w:t>erência</w:t>
-      </w:r>
-      <w:r>
-        <w:rPr>
-          <w:rFonts w:ascii="Arial" w:hAnsi="Arial" w:cs="Arial"/>
-        </w:rPr>
-        <w:t>.</w:t>
+        <w:t>Dentro d</w:t>
+      </w:r>
+      <w:r>
+        <w:rPr>
+          <w:rFonts w:ascii="Arial" w:hAnsi="Arial" w:cs="Arial"/>
+        </w:rPr>
+        <w:t>o repositó</w:t>
+      </w:r>
+      <w:r>
+        <w:rPr>
+          <w:rFonts w:ascii="Arial" w:hAnsi="Arial" w:cs="Arial"/>
+        </w:rPr>
+        <w:t>rio</w:t>
+      </w:r>
+      <w:r>
+        <w:rPr>
+          <w:rFonts w:ascii="Arial" w:hAnsi="Arial" w:cs="Arial"/>
+        </w:rPr>
+        <w:t xml:space="preserve"> do projeto já descompactado</w:t>
+      </w:r>
+      <w:r>
+        <w:rPr>
+          <w:rFonts w:ascii="Arial" w:hAnsi="Arial" w:cs="Arial"/>
+        </w:rPr>
+        <w:t>,</w:t>
+      </w:r>
+      <w:r>
+        <w:rPr>
+          <w:rFonts w:ascii="Arial" w:hAnsi="Arial" w:cs="Arial"/>
+        </w:rPr>
+        <w:t xml:space="preserve"> navegue</w:t>
+      </w:r>
+      <w:r>
+        <w:rPr>
+          <w:rFonts w:ascii="Arial" w:hAnsi="Arial" w:cs="Arial"/>
+        </w:rPr>
+        <w:t xml:space="preserve"> até</w:t>
+      </w:r>
+      <w:r>
+        <w:rPr>
+          <w:rFonts w:ascii="Arial" w:hAnsi="Arial" w:cs="Arial"/>
+        </w:rPr>
+        <w:t xml:space="preserve"> o caminho</w:t>
       </w:r>
       <w:r>
         <w:rPr>
@@ -808,42 +920,6 @@
         <w:rPr>
           <w:rFonts w:ascii="Arial" w:hAnsi="Arial" w:cs="Arial"/>
         </w:rPr>
-        <w:t>Dentro d</w:t>
-      </w:r>
-      <w:r>
-        <w:rPr>
-          <w:rFonts w:ascii="Arial" w:hAnsi="Arial" w:cs="Arial"/>
-        </w:rPr>
-        <w:t>o repositó</w:t>
-      </w:r>
-      <w:r>
-        <w:rPr>
-          <w:rFonts w:ascii="Arial" w:hAnsi="Arial" w:cs="Arial"/>
-        </w:rPr>
-        <w:t>rio,</w:t>
-      </w:r>
-      <w:r>
-        <w:rPr>
-          <w:rFonts w:ascii="Arial" w:hAnsi="Arial" w:cs="Arial"/>
-        </w:rPr>
-        <w:t xml:space="preserve"> navegue</w:t>
-      </w:r>
-      <w:r>
-        <w:rPr>
-          <w:rFonts w:ascii="Arial" w:hAnsi="Arial" w:cs="Arial"/>
-        </w:rPr>
-        <w:t xml:space="preserve"> até</w:t>
-      </w:r>
-      <w:r>
-        <w:rPr>
-          <w:rFonts w:ascii="Arial" w:hAnsi="Arial" w:cs="Arial"/>
-        </w:rPr>
-        <w:t xml:space="preserve"> </w:t>
-      </w:r>
-      <w:r>
-        <w:rPr>
-          <w:rFonts w:ascii="Arial" w:hAnsi="Arial" w:cs="Arial"/>
-        </w:rPr>
         <w:t>“</w:t>
       </w:r>
       <w:proofErr w:type="spellStart"/>
@@ -966,20 +1042,26 @@
         <w:rPr>
           <w:rFonts w:ascii="Arial" w:hAnsi="Arial" w:cs="Arial"/>
         </w:rPr>
+        <w:t>, que está dentro deste diretório</w:t>
+      </w:r>
+      <w:r>
+        <w:rPr>
+          <w:rFonts w:ascii="Arial" w:hAnsi="Arial" w:cs="Arial"/>
+        </w:rPr>
         <w:t>:</w:t>
       </w:r>
     </w:p>
     <w:p>
       <w:pPr>
+        <w:keepNext/>
         <w:jc w:val="center"/>
-        <w:rPr>
-          <w:rFonts w:ascii="Arial" w:hAnsi="Arial" w:cs="Arial"/>
-        </w:rPr>
-      </w:pPr>
-      <w:r>
-        <w:rPr>
-          <w:rFonts w:ascii="Arial" w:hAnsi="Arial" w:cs="Arial"/>
-        </w:rPr>
+      </w:pPr>
+      <w:r>
+        <w:rPr>
+          <w:rFonts w:ascii="Arial" w:hAnsi="Arial" w:cs="Arial"/>
+          <w:noProof/>
+        </w:rPr>
+        <w:lastRenderedPageBreak/>
         <w:drawing>
           <wp:inline distT="0" distB="0" distL="0" distR="0" wp14:anchorId="6B55D8D1" wp14:editId="1750E3AE">
             <wp:extent cx="5400040" cy="1595120"/>
@@ -1002,7 +1084,7 @@
                     <pic:cNvPicPr/>
                   </pic:nvPicPr>
                   <pic:blipFill>
-                    <a:blip r:embed="rId9"/>
+                    <a:blip r:embed="rId10"/>
                     <a:stretch>
                       <a:fillRect/>
                     </a:stretch>
@@ -1025,6 +1107,37 @@
     </w:p>
     <w:p>
       <w:pPr>
+        <w:pStyle w:val="Legenda"/>
+        <w:jc w:val="center"/>
+        <w:rPr>
+          <w:rFonts w:ascii="Arial" w:hAnsi="Arial" w:cs="Arial"/>
+        </w:rPr>
+      </w:pPr>
+      <w:r>
+        <w:t xml:space="preserve">Figura </w:t>
+      </w:r>
+      <w:fldSimple w:instr=" SEQ Figura \* ARABIC ">
+        <w:r>
+          <w:rPr>
+            <w:noProof/>
+          </w:rPr>
+          <w:t>2</w:t>
+        </w:r>
+      </w:fldSimple>
+      <w:r>
+        <w:t xml:space="preserve"> - Projeto descompactado</w:t>
+      </w:r>
+    </w:p>
+    <w:p>
+      <w:pPr>
+        <w:jc w:val="center"/>
+        <w:rPr>
+          <w:rFonts w:ascii="Arial" w:hAnsi="Arial" w:cs="Arial"/>
+        </w:rPr>
+      </w:pPr>
+    </w:p>
+    <w:p>
+      <w:pPr>
         <w:ind w:firstLine="567"/>
         <w:jc w:val="both"/>
         <w:rPr>
@@ -1247,7 +1360,6 @@
         </w:rPr>
         <w:t xml:space="preserve">xtensão </w:t>
       </w:r>
-      <w:proofErr w:type="gramStart"/>
       <w:r>
         <w:rPr>
           <w:rFonts w:ascii="Arial" w:hAnsi="Arial" w:cs="Arial"/>
@@ -1274,7 +1386,6 @@
         <w:t>pr</w:t>
       </w:r>
       <w:proofErr w:type="spellEnd"/>
-      <w:proofErr w:type="gramEnd"/>
       <w:r>
         <w:rPr>
           <w:rFonts w:ascii="Arial" w:hAnsi="Arial" w:cs="Arial"/>
@@ -1320,16 +1431,14 @@
     </w:p>
     <w:p>
       <w:pPr>
+        <w:keepNext/>
         <w:jc w:val="center"/>
-        <w:rPr>
-          <w:rFonts w:ascii="Arial" w:hAnsi="Arial" w:cs="Arial"/>
-        </w:rPr>
-      </w:pPr>
-      <w:r>
-        <w:rPr>
-          <w:rFonts w:ascii="Arial" w:hAnsi="Arial" w:cs="Arial"/>
-        </w:rPr>
-        <w:lastRenderedPageBreak/>
+      </w:pPr>
+      <w:r>
+        <w:rPr>
+          <w:rFonts w:ascii="Arial" w:hAnsi="Arial" w:cs="Arial"/>
+          <w:noProof/>
+        </w:rPr>
         <w:drawing>
           <wp:inline distT="0" distB="0" distL="0" distR="0" wp14:anchorId="4021C22E" wp14:editId="0F564CC0">
             <wp:extent cx="5400040" cy="2470150"/>
@@ -1352,7 +1461,7 @@
                     <pic:cNvPicPr/>
                   </pic:nvPicPr>
                   <pic:blipFill>
-                    <a:blip r:embed="rId10"/>
+                    <a:blip r:embed="rId11"/>
                     <a:stretch>
                       <a:fillRect/>
                     </a:stretch>
@@ -1375,6 +1484,29 @@
     </w:p>
     <w:p>
       <w:pPr>
+        <w:pStyle w:val="Legenda"/>
+        <w:jc w:val="center"/>
+        <w:rPr>
+          <w:rFonts w:ascii="Arial" w:hAnsi="Arial" w:cs="Arial"/>
+        </w:rPr>
+      </w:pPr>
+      <w:r>
+        <w:t xml:space="preserve">Figura </w:t>
+      </w:r>
+      <w:fldSimple w:instr=" SEQ Figura \* ARABIC ">
+        <w:r>
+          <w:rPr>
+            <w:noProof/>
+          </w:rPr>
+          <w:t>3</w:t>
+        </w:r>
+      </w:fldSimple>
+      <w:r>
+        <w:t xml:space="preserve"> - Abertura do projeto no Vivado</w:t>
+      </w:r>
+    </w:p>
+    <w:p>
+      <w:pPr>
         <w:ind w:firstLine="567"/>
         <w:jc w:val="both"/>
         <w:rPr>
@@ -1447,14 +1579,14 @@
     </w:p>
     <w:p>
       <w:pPr>
-        <w:rPr>
-          <w:rFonts w:ascii="Arial" w:hAnsi="Arial" w:cs="Arial"/>
-        </w:rPr>
-      </w:pPr>
-      <w:r>
-        <w:rPr>
-          <w:rFonts w:ascii="Arial" w:hAnsi="Arial" w:cs="Arial"/>
-        </w:rPr>
+        <w:keepNext/>
+      </w:pPr>
+      <w:r>
+        <w:rPr>
+          <w:rFonts w:ascii="Arial" w:hAnsi="Arial" w:cs="Arial"/>
+          <w:noProof/>
+        </w:rPr>
+        <w:lastRenderedPageBreak/>
         <w:drawing>
           <wp:inline distT="0" distB="0" distL="0" distR="0" wp14:anchorId="65C43218" wp14:editId="687CE980">
             <wp:extent cx="5400040" cy="2864485"/>
@@ -1477,7 +1609,7 @@
                     <pic:cNvPicPr/>
                   </pic:nvPicPr>
                   <pic:blipFill>
-                    <a:blip r:embed="rId11"/>
+                    <a:blip r:embed="rId12"/>
                     <a:stretch>
                       <a:fillRect/>
                     </a:stretch>
@@ -1500,6 +1632,29 @@
     </w:p>
     <w:p>
       <w:pPr>
+        <w:pStyle w:val="Legenda"/>
+        <w:jc w:val="center"/>
+        <w:rPr>
+          <w:rFonts w:ascii="Arial" w:hAnsi="Arial" w:cs="Arial"/>
+        </w:rPr>
+      </w:pPr>
+      <w:r>
+        <w:t xml:space="preserve">Figura </w:t>
+      </w:r>
+      <w:fldSimple w:instr=" SEQ Figura \* ARABIC ">
+        <w:r>
+          <w:rPr>
+            <w:noProof/>
+          </w:rPr>
+          <w:t>4</w:t>
+        </w:r>
+      </w:fldSimple>
+      <w:r>
+        <w:t xml:space="preserve"> - Tela inicial do Vivado</w:t>
+      </w:r>
+    </w:p>
+    <w:p>
+      <w:pPr>
         <w:rPr>
           <w:rFonts w:ascii="Arial" w:hAnsi="Arial" w:cs="Arial"/>
         </w:rPr>
@@ -1785,20 +1940,18 @@
     </w:p>
     <w:p>
       <w:pPr>
+        <w:keepNext/>
         <w:jc w:val="center"/>
-        <w:rPr>
-          <w:rFonts w:ascii="Arial" w:hAnsi="Arial" w:cs="Arial"/>
-        </w:rPr>
-      </w:pPr>
-      <w:r>
-        <w:rPr>
-          <w:rFonts w:ascii="Arial" w:hAnsi="Arial" w:cs="Arial"/>
-        </w:rPr>
-        <w:lastRenderedPageBreak/>
+      </w:pPr>
+      <w:r>
+        <w:rPr>
+          <w:rFonts w:ascii="Arial" w:hAnsi="Arial" w:cs="Arial"/>
+          <w:noProof/>
+        </w:rPr>
         <w:drawing>
-          <wp:inline distT="0" distB="0" distL="0" distR="0" wp14:anchorId="1E606F8E" wp14:editId="61B54971">
-            <wp:extent cx="5379177" cy="4087495"/>
-            <wp:effectExtent l="0" t="0" r="0" b="8255"/>
+          <wp:inline distT="0" distB="0" distL="0" distR="0" wp14:anchorId="1E606F8E" wp14:editId="7885F79E">
+            <wp:extent cx="4803404" cy="3649980"/>
+            <wp:effectExtent l="0" t="0" r="0" b="7620"/>
             <wp:docPr id="1073717331" name="Imagem 5">
               <a:extLst xmlns:a="http://schemas.openxmlformats.org/drawingml/2006/main">
                 <a:ext uri="{FF2B5EF4-FFF2-40B4-BE49-F238E27FC236}">
@@ -1817,7 +1970,7 @@
                     <pic:cNvPicPr/>
                   </pic:nvPicPr>
                   <pic:blipFill>
-                    <a:blip r:embed="rId12">
+                    <a:blip r:embed="rId13">
                       <a:extLst>
                         <a:ext uri="{28A0092B-C50C-407E-A947-70E740481C1C}">
                           <a14:useLocalDpi xmlns:a14="http://schemas.microsoft.com/office/drawing/2010/main" val="0"/>
@@ -1831,7 +1984,7 @@
                   <pic:spPr>
                     <a:xfrm>
                       <a:off x="0" y="0"/>
-                      <a:ext cx="5379177" cy="4087495"/>
+                      <a:ext cx="4806101" cy="3652029"/>
                     </a:xfrm>
                     <a:prstGeom prst="rect">
                       <a:avLst/>
@@ -1846,11 +1999,50 @@
     </w:p>
     <w:p>
       <w:pPr>
+        <w:pStyle w:val="Legenda"/>
         <w:jc w:val="center"/>
         <w:rPr>
           <w:rFonts w:ascii="Arial" w:hAnsi="Arial" w:cs="Arial"/>
         </w:rPr>
       </w:pPr>
+      <w:r>
+        <w:t xml:space="preserve">Figura </w:t>
+      </w:r>
+      <w:fldSimple w:instr=" SEQ Figura \* ARABIC ">
+        <w:r>
+          <w:rPr>
+            <w:noProof/>
+          </w:rPr>
+          <w:t>5</w:t>
+        </w:r>
+      </w:fldSimple>
+      <w:r>
+        <w:t xml:space="preserve"> - Área </w:t>
+      </w:r>
+      <w:proofErr w:type="spellStart"/>
+      <w:r>
+        <w:t>Sources</w:t>
+      </w:r>
+      <w:proofErr w:type="spellEnd"/>
+      <w:r>
+        <w:t xml:space="preserve"> do Vivado</w:t>
+      </w:r>
+    </w:p>
+    <w:p>
+      <w:pPr>
+        <w:ind w:firstLine="567"/>
+        <w:jc w:val="both"/>
+        <w:rPr>
+          <w:rFonts w:ascii="Arial" w:hAnsi="Arial" w:cs="Arial"/>
+        </w:rPr>
+      </w:pPr>
+      <w:r>
+        <w:rPr>
+          <w:rFonts w:ascii="Arial" w:hAnsi="Arial" w:cs="Arial"/>
+        </w:rPr>
+        <w:lastRenderedPageBreak/>
+        <w:t>Na tabela a seguir, descreve-se qual a função de cada um destes arquivos:</w:t>
+      </w:r>
     </w:p>
     <w:tbl>
       <w:tblPr>
@@ -1878,8 +2070,6 @@
                 <w:rFonts w:ascii="Arial" w:hAnsi="Arial" w:cs="Arial"/>
                 <w:b/>
                 <w:bCs/>
-                <w:sz w:val="16"/>
-                <w:szCs w:val="16"/>
               </w:rPr>
             </w:pPr>
             <w:r>
@@ -1887,8 +2077,63 @@
                 <w:rFonts w:ascii="Arial" w:hAnsi="Arial" w:cs="Arial"/>
                 <w:b/>
                 <w:bCs/>
-                <w:sz w:val="16"/>
-                <w:szCs w:val="16"/>
+              </w:rPr>
+              <w:t>Arquivo</w:t>
+            </w:r>
+          </w:p>
+        </w:tc>
+        <w:tc>
+          <w:tcPr>
+            <w:tcW w:w="4247" w:type="dxa"/>
+            <w:vAlign w:val="center"/>
+          </w:tcPr>
+          <w:p>
+            <w:pPr>
+              <w:jc w:val="center"/>
+              <w:rPr>
+                <w:rFonts w:ascii="Arial" w:hAnsi="Arial" w:cs="Arial"/>
+                <w:b/>
+                <w:bCs/>
+              </w:rPr>
+            </w:pPr>
+            <w:r>
+              <w:rPr>
+                <w:rFonts w:ascii="Arial" w:hAnsi="Arial" w:cs="Arial"/>
+                <w:b/>
+                <w:bCs/>
+              </w:rPr>
+              <w:t>Função</w:t>
+            </w:r>
+          </w:p>
+        </w:tc>
+      </w:tr>
+      <w:tr>
+        <w:trPr>
+          <w:trHeight w:val="795"/>
+        </w:trPr>
+        <w:tc>
+          <w:tcPr>
+            <w:tcW w:w="4247" w:type="dxa"/>
+            <w:vAlign w:val="center"/>
+          </w:tcPr>
+          <w:p>
+            <w:pPr>
+              <w:jc w:val="center"/>
+              <w:rPr>
+                <w:rFonts w:ascii="Arial" w:hAnsi="Arial" w:cs="Arial"/>
+                <w:b/>
+                <w:bCs/>
+                <w:sz w:val="20"/>
+                <w:szCs w:val="20"/>
+              </w:rPr>
+            </w:pPr>
+            <w:r>
+              <w:rPr>
+                <w:rFonts w:ascii="Arial" w:hAnsi="Arial" w:cs="Arial"/>
+                <w:b/>
+                <w:bCs/>
+                <w:sz w:val="20"/>
+                <w:szCs w:val="20"/>
               </w:rPr>
               <w:t xml:space="preserve">Design </w:t>
             </w:r>
@@ -1898,8 +2143,8 @@
                 <w:rFonts w:ascii="Arial" w:hAnsi="Arial" w:cs="Arial"/>
                 <w:b/>
                 <w:bCs/>
-                <w:sz w:val="16"/>
-                <w:szCs w:val="16"/>
+                <w:sz w:val="20"/>
+                <w:szCs w:val="20"/>
               </w:rPr>
               <w:t>Source</w:t>
             </w:r>
@@ -1909,8 +2154,8 @@
                 <w:rFonts w:ascii="Arial" w:hAnsi="Arial" w:cs="Arial"/>
                 <w:b/>
                 <w:bCs/>
-                <w:sz w:val="16"/>
-                <w:szCs w:val="16"/>
+                <w:sz w:val="20"/>
+                <w:szCs w:val="20"/>
               </w:rPr>
               <w:t xml:space="preserve"> </w:t>
             </w:r>
@@ -1919,8 +2164,8 @@
                 <w:rFonts w:ascii="Arial" w:hAnsi="Arial" w:cs="Arial"/>
                 <w:b/>
                 <w:bCs/>
-                <w:sz w:val="16"/>
-                <w:szCs w:val="16"/>
+                <w:sz w:val="20"/>
+                <w:szCs w:val="20"/>
               </w:rPr>
               <w:t>(</w:t>
             </w:r>
@@ -1930,8 +2175,8 @@
                 <w:rFonts w:ascii="Arial" w:hAnsi="Arial" w:cs="Arial"/>
                 <w:b/>
                 <w:bCs/>
-                <w:sz w:val="16"/>
-                <w:szCs w:val="16"/>
+                <w:sz w:val="20"/>
+                <w:szCs w:val="20"/>
               </w:rPr>
               <w:t>modulador_nrzl</w:t>
             </w:r>
@@ -1941,8 +2186,8 @@
                 <w:rFonts w:ascii="Arial" w:hAnsi="Arial" w:cs="Arial"/>
                 <w:b/>
                 <w:bCs/>
-                <w:sz w:val="16"/>
-                <w:szCs w:val="16"/>
+                <w:sz w:val="20"/>
+                <w:szCs w:val="20"/>
               </w:rPr>
               <w:t>)</w:t>
             </w:r>
@@ -1958,23 +2203,23 @@
               <w:jc w:val="center"/>
               <w:rPr>
                 <w:rFonts w:ascii="Arial" w:hAnsi="Arial" w:cs="Arial"/>
-                <w:sz w:val="16"/>
-                <w:szCs w:val="16"/>
+                <w:sz w:val="20"/>
+                <w:szCs w:val="20"/>
               </w:rPr>
             </w:pPr>
             <w:r>
               <w:rPr>
                 <w:rFonts w:ascii="Arial" w:hAnsi="Arial" w:cs="Arial"/>
-                <w:sz w:val="16"/>
-                <w:szCs w:val="16"/>
+                <w:sz w:val="20"/>
+                <w:szCs w:val="20"/>
               </w:rPr>
               <w:t>Contém o código principal</w:t>
             </w:r>
             <w:r>
               <w:rPr>
                 <w:rFonts w:ascii="Arial" w:hAnsi="Arial" w:cs="Arial"/>
-                <w:sz w:val="16"/>
-                <w:szCs w:val="16"/>
+                <w:sz w:val="20"/>
+                <w:szCs w:val="20"/>
               </w:rPr>
               <w:t xml:space="preserve"> do circuito FPGA.</w:t>
             </w:r>
@@ -1994,8 +2239,8 @@
                 <w:rFonts w:ascii="Arial" w:hAnsi="Arial" w:cs="Arial"/>
                 <w:b/>
                 <w:bCs/>
-                <w:sz w:val="16"/>
-                <w:szCs w:val="16"/>
+                <w:sz w:val="20"/>
+                <w:szCs w:val="20"/>
               </w:rPr>
             </w:pPr>
             <w:proofErr w:type="spellStart"/>
@@ -2004,8 +2249,8 @@
                 <w:rFonts w:ascii="Arial" w:hAnsi="Arial" w:cs="Arial"/>
                 <w:b/>
                 <w:bCs/>
-                <w:sz w:val="16"/>
-                <w:szCs w:val="16"/>
+                <w:sz w:val="20"/>
+                <w:szCs w:val="20"/>
               </w:rPr>
               <w:t>Constraints</w:t>
             </w:r>
@@ -2015,8 +2260,8 @@
                 <w:rFonts w:ascii="Arial" w:hAnsi="Arial" w:cs="Arial"/>
                 <w:b/>
                 <w:bCs/>
-                <w:sz w:val="16"/>
-                <w:szCs w:val="16"/>
+                <w:sz w:val="20"/>
+                <w:szCs w:val="20"/>
               </w:rPr>
               <w:t xml:space="preserve"> (</w:t>
             </w:r>
@@ -2026,8 +2271,8 @@
                 <w:rFonts w:ascii="Arial" w:hAnsi="Arial" w:cs="Arial"/>
                 <w:b/>
                 <w:bCs/>
-                <w:sz w:val="16"/>
-                <w:szCs w:val="16"/>
+                <w:sz w:val="20"/>
+                <w:szCs w:val="20"/>
               </w:rPr>
               <w:t>modulazor_nrzl.xdc</w:t>
             </w:r>
@@ -2037,8 +2282,8 @@
                 <w:rFonts w:ascii="Arial" w:hAnsi="Arial" w:cs="Arial"/>
                 <w:b/>
                 <w:bCs/>
-                <w:sz w:val="16"/>
-                <w:szCs w:val="16"/>
+                <w:sz w:val="20"/>
+                <w:szCs w:val="20"/>
               </w:rPr>
               <w:t>)</w:t>
             </w:r>
@@ -2054,31 +2299,31 @@
               <w:jc w:val="center"/>
               <w:rPr>
                 <w:rFonts w:ascii="Arial" w:hAnsi="Arial" w:cs="Arial"/>
-                <w:sz w:val="16"/>
-                <w:szCs w:val="16"/>
+                <w:sz w:val="20"/>
+                <w:szCs w:val="20"/>
               </w:rPr>
             </w:pPr>
             <w:r>
               <w:rPr>
                 <w:rFonts w:ascii="Arial" w:hAnsi="Arial" w:cs="Arial"/>
-                <w:sz w:val="16"/>
-                <w:szCs w:val="16"/>
+                <w:sz w:val="20"/>
+                <w:szCs w:val="20"/>
               </w:rPr>
               <w:t xml:space="preserve">Contém o mapeamento das </w:t>
             </w:r>
             <w:r>
               <w:rPr>
                 <w:rFonts w:ascii="Arial" w:hAnsi="Arial" w:cs="Arial"/>
-                <w:sz w:val="16"/>
-                <w:szCs w:val="16"/>
+                <w:sz w:val="20"/>
+                <w:szCs w:val="20"/>
               </w:rPr>
               <w:t>entradas e saídas</w:t>
             </w:r>
             <w:r>
               <w:rPr>
                 <w:rFonts w:ascii="Arial" w:hAnsi="Arial" w:cs="Arial"/>
-                <w:sz w:val="16"/>
-                <w:szCs w:val="16"/>
+                <w:sz w:val="20"/>
+                <w:szCs w:val="20"/>
               </w:rPr>
               <w:t xml:space="preserve"> do circuito definidas no Design </w:t>
             </w:r>
@@ -2086,8 +2331,8 @@
             <w:r>
               <w:rPr>
                 <w:rFonts w:ascii="Arial" w:hAnsi="Arial" w:cs="Arial"/>
-                <w:sz w:val="16"/>
-                <w:szCs w:val="16"/>
+                <w:sz w:val="20"/>
+                <w:szCs w:val="20"/>
               </w:rPr>
               <w:t>Source</w:t>
             </w:r>
@@ -2095,24 +2340,24 @@
             <w:r>
               <w:rPr>
                 <w:rFonts w:ascii="Arial" w:hAnsi="Arial" w:cs="Arial"/>
-                <w:sz w:val="16"/>
-                <w:szCs w:val="16"/>
+                <w:sz w:val="20"/>
+                <w:szCs w:val="20"/>
               </w:rPr>
               <w:t xml:space="preserve">, para </w:t>
             </w:r>
             <w:r>
               <w:rPr>
                 <w:rFonts w:ascii="Arial" w:hAnsi="Arial" w:cs="Arial"/>
-                <w:sz w:val="16"/>
-                <w:szCs w:val="16"/>
+                <w:sz w:val="20"/>
+                <w:szCs w:val="20"/>
               </w:rPr>
               <w:t xml:space="preserve">vinculá-las </w:t>
             </w:r>
             <w:r>
               <w:rPr>
                 <w:rFonts w:ascii="Arial" w:hAnsi="Arial" w:cs="Arial"/>
-                <w:sz w:val="16"/>
-                <w:szCs w:val="16"/>
+                <w:sz w:val="20"/>
+                <w:szCs w:val="20"/>
               </w:rPr>
               <w:t>às portas do circuito físico.</w:t>
             </w:r>
@@ -2121,7 +2366,7 @@
       </w:tr>
       <w:tr>
         <w:trPr>
-          <w:trHeight w:val="1276"/>
+          <w:trHeight w:val="934"/>
         </w:trPr>
         <w:tc>
           <w:tcPr>
@@ -2135,8 +2380,8 @@
                 <w:rFonts w:ascii="Arial" w:hAnsi="Arial" w:cs="Arial"/>
                 <w:b/>
                 <w:bCs/>
-                <w:sz w:val="16"/>
-                <w:szCs w:val="16"/>
+                <w:sz w:val="20"/>
+                <w:szCs w:val="20"/>
               </w:rPr>
             </w:pPr>
             <w:proofErr w:type="spellStart"/>
@@ -2145,8 +2390,8 @@
                 <w:rFonts w:ascii="Arial" w:hAnsi="Arial" w:cs="Arial"/>
                 <w:b/>
                 <w:bCs/>
-                <w:sz w:val="16"/>
-                <w:szCs w:val="16"/>
+                <w:sz w:val="20"/>
+                <w:szCs w:val="20"/>
               </w:rPr>
               <w:t>Simulation</w:t>
             </w:r>
@@ -2156,8 +2401,8 @@
                 <w:rFonts w:ascii="Arial" w:hAnsi="Arial" w:cs="Arial"/>
                 <w:b/>
                 <w:bCs/>
-                <w:sz w:val="16"/>
-                <w:szCs w:val="16"/>
+                <w:sz w:val="20"/>
+                <w:szCs w:val="20"/>
               </w:rPr>
               <w:t xml:space="preserve"> </w:t>
             </w:r>
@@ -2167,8 +2412,8 @@
                 <w:rFonts w:ascii="Arial" w:hAnsi="Arial" w:cs="Arial"/>
                 <w:b/>
                 <w:bCs/>
-                <w:sz w:val="16"/>
-                <w:szCs w:val="16"/>
+                <w:sz w:val="20"/>
+                <w:szCs w:val="20"/>
               </w:rPr>
               <w:t>Source</w:t>
             </w:r>
@@ -2178,8 +2423,8 @@
                 <w:rFonts w:ascii="Arial" w:hAnsi="Arial" w:cs="Arial"/>
                 <w:b/>
                 <w:bCs/>
-                <w:sz w:val="16"/>
-                <w:szCs w:val="16"/>
+                <w:sz w:val="20"/>
+                <w:szCs w:val="20"/>
               </w:rPr>
               <w:t xml:space="preserve"> (</w:t>
             </w:r>
@@ -2189,8 +2434,8 @@
                 <w:rFonts w:ascii="Arial" w:hAnsi="Arial" w:cs="Arial"/>
                 <w:b/>
                 <w:bCs/>
-                <w:sz w:val="16"/>
-                <w:szCs w:val="16"/>
+                <w:sz w:val="20"/>
+                <w:szCs w:val="20"/>
               </w:rPr>
               <w:t>tb_modulador_nrzl</w:t>
             </w:r>
@@ -2200,8 +2445,8 @@
                 <w:rFonts w:ascii="Arial" w:hAnsi="Arial" w:cs="Arial"/>
                 <w:b/>
                 <w:bCs/>
-                <w:sz w:val="16"/>
-                <w:szCs w:val="16"/>
+                <w:sz w:val="20"/>
+                <w:szCs w:val="20"/>
               </w:rPr>
               <w:t>)</w:t>
             </w:r>
@@ -2214,42 +2459,43 @@
           </w:tcPr>
           <w:p>
             <w:pPr>
+              <w:keepNext/>
               <w:jc w:val="center"/>
               <w:rPr>
                 <w:rFonts w:ascii="Arial" w:hAnsi="Arial" w:cs="Arial"/>
-                <w:sz w:val="16"/>
-                <w:szCs w:val="16"/>
+                <w:sz w:val="20"/>
+                <w:szCs w:val="20"/>
               </w:rPr>
             </w:pPr>
             <w:r>
               <w:rPr>
                 <w:rFonts w:ascii="Arial" w:hAnsi="Arial" w:cs="Arial"/>
-                <w:sz w:val="16"/>
-                <w:szCs w:val="16"/>
+                <w:sz w:val="20"/>
+                <w:szCs w:val="20"/>
               </w:rPr>
               <w:t xml:space="preserve">Contém o </w:t>
             </w:r>
             <w:r>
               <w:rPr>
                 <w:rFonts w:ascii="Arial" w:hAnsi="Arial" w:cs="Arial"/>
-                <w:sz w:val="16"/>
-                <w:szCs w:val="16"/>
+                <w:sz w:val="20"/>
+                <w:szCs w:val="20"/>
               </w:rPr>
               <w:t xml:space="preserve">código necessário para simular o funcionamento da placa FPGA </w:t>
             </w:r>
             <w:r>
               <w:rPr>
                 <w:rFonts w:ascii="Arial" w:hAnsi="Arial" w:cs="Arial"/>
-                <w:sz w:val="16"/>
-                <w:szCs w:val="16"/>
+                <w:sz w:val="20"/>
+                <w:szCs w:val="20"/>
               </w:rPr>
               <w:t xml:space="preserve">no Vivado, sem </w:t>
             </w:r>
             <w:r>
               <w:rPr>
                 <w:rFonts w:ascii="Arial" w:hAnsi="Arial" w:cs="Arial"/>
-                <w:sz w:val="16"/>
-                <w:szCs w:val="16"/>
+                <w:sz w:val="20"/>
+                <w:szCs w:val="20"/>
               </w:rPr>
               <w:t>precisar do hardware.</w:t>
             </w:r>
@@ -2259,12 +2505,25 @@
     </w:tbl>
     <w:p>
       <w:pPr>
+        <w:pStyle w:val="Legenda"/>
         <w:jc w:val="center"/>
-        <w:rPr>
-          <w:rFonts w:ascii="Arial" w:hAnsi="Arial" w:cs="Arial"/>
-        </w:rPr>
-      </w:pPr>
-    </w:p>
+      </w:pPr>
+      <w:r>
+        <w:t xml:space="preserve">Tabela </w:t>
+      </w:r>
+      <w:fldSimple w:instr=" SEQ Tabela \* ARABIC ">
+        <w:r>
+          <w:rPr>
+            <w:noProof/>
+          </w:rPr>
+          <w:t>1</w:t>
+        </w:r>
+      </w:fldSimple>
+      <w:r>
+        <w:t xml:space="preserve"> - Arquivos do circuito no Vivado</w:t>
+      </w:r>
+    </w:p>
+    <w:p/>
     <w:p>
       <w:pPr>
         <w:ind w:firstLine="567"/>
@@ -2314,20 +2573,20 @@
     </w:p>
     <w:p>
       <w:pPr>
-        <w:jc w:val="both"/>
-        <w:rPr>
-          <w:rFonts w:ascii="Arial" w:hAnsi="Arial" w:cs="Arial"/>
-        </w:rPr>
-      </w:pPr>
-      <w:r>
-        <w:rPr>
-          <w:rFonts w:ascii="Arial" w:hAnsi="Arial" w:cs="Arial"/>
-        </w:rPr>
-        <w:lastRenderedPageBreak/>
+        <w:jc w:val="center"/>
+        <w:rPr>
+          <w:rFonts w:ascii="Arial" w:hAnsi="Arial" w:cs="Arial"/>
+        </w:rPr>
+      </w:pPr>
+      <w:r>
+        <w:rPr>
+          <w:rFonts w:ascii="Arial" w:hAnsi="Arial" w:cs="Arial"/>
+          <w:noProof/>
+        </w:rPr>
         <w:drawing>
-          <wp:inline distT="0" distB="0" distL="0" distR="0" wp14:anchorId="2939D678" wp14:editId="27513E7D">
-            <wp:extent cx="5960371" cy="2141220"/>
-            <wp:effectExtent l="0" t="0" r="2540" b="0"/>
+          <wp:inline distT="0" distB="0" distL="0" distR="0" wp14:anchorId="2939D678" wp14:editId="6F00D949">
+            <wp:extent cx="5962884" cy="2071794"/>
+            <wp:effectExtent l="0" t="0" r="0" b="5080"/>
             <wp:docPr id="1468780804" name="Imagem 1"/>
             <wp:cNvGraphicFramePr>
               <a:graphicFrameLocks xmlns:a="http://schemas.openxmlformats.org/drawingml/2006/main" noChangeAspect="1"/>
@@ -2336,11 +2595,17 @@
               <a:graphicData uri="http://schemas.openxmlformats.org/drawingml/2006/picture">
                 <pic:pic xmlns:pic="http://schemas.openxmlformats.org/drawingml/2006/picture">
                   <pic:nvPicPr>
-                    <pic:cNvPr id="1468780804" name=""/>
+                    <pic:cNvPr id="1468780804" name="Imagem 1"/>
                     <pic:cNvPicPr/>
                   </pic:nvPicPr>
                   <pic:blipFill>
-                    <a:blip r:embed="rId13"/>
+                    <a:blip r:embed="rId14" cstate="print">
+                      <a:extLst>
+                        <a:ext uri="{28A0092B-C50C-407E-A947-70E740481C1C}">
+                          <a14:useLocalDpi xmlns:a14="http://schemas.microsoft.com/office/drawing/2010/main" val="0"/>
+                        </a:ext>
+                      </a:extLst>
+                    </a:blip>
                     <a:stretch>
                       <a:fillRect/>
                     </a:stretch>
@@ -2348,7 +2613,7 @@
                   <pic:spPr>
                     <a:xfrm>
                       <a:off x="0" y="0"/>
-                      <a:ext cx="5962884" cy="2142123"/>
+                      <a:ext cx="5962884" cy="2071794"/>
                     </a:xfrm>
                     <a:prstGeom prst="rect">
                       <a:avLst/>
@@ -2363,19 +2628,18 @@
     </w:p>
     <w:p>
       <w:pPr>
-        <w:jc w:val="both"/>
-        <w:rPr>
-          <w:rFonts w:ascii="Arial" w:hAnsi="Arial" w:cs="Arial"/>
-        </w:rPr>
-      </w:pPr>
-      <w:r>
-        <w:rPr>
-          <w:rFonts w:ascii="Arial" w:hAnsi="Arial" w:cs="Arial"/>
+        <w:keepNext/>
+        <w:jc w:val="center"/>
+      </w:pPr>
+      <w:r>
+        <w:rPr>
+          <w:rFonts w:ascii="Arial" w:hAnsi="Arial" w:cs="Arial"/>
+          <w:noProof/>
         </w:rPr>
         <w:drawing>
-          <wp:inline distT="0" distB="0" distL="0" distR="0" wp14:anchorId="312342AD" wp14:editId="4EF04165">
-            <wp:extent cx="5400040" cy="1703070"/>
-            <wp:effectExtent l="0" t="0" r="0" b="0"/>
+          <wp:inline distT="0" distB="0" distL="0" distR="0" wp14:anchorId="312342AD" wp14:editId="70F2B108">
+            <wp:extent cx="5947833" cy="1594485"/>
+            <wp:effectExtent l="0" t="0" r="0" b="5715"/>
             <wp:docPr id="199178183" name="Imagem 1"/>
             <wp:cNvGraphicFramePr>
               <a:graphicFrameLocks xmlns:a="http://schemas.openxmlformats.org/drawingml/2006/main" noChangeAspect="1"/>
@@ -2384,11 +2648,17 @@
               <a:graphicData uri="http://schemas.openxmlformats.org/drawingml/2006/picture">
                 <pic:pic xmlns:pic="http://schemas.openxmlformats.org/drawingml/2006/picture">
                   <pic:nvPicPr>
-                    <pic:cNvPr id="199178183" name=""/>
+                    <pic:cNvPr id="199178183" name="Imagem 1"/>
                     <pic:cNvPicPr/>
                   </pic:nvPicPr>
                   <pic:blipFill>
-                    <a:blip r:embed="rId14"/>
+                    <a:blip r:embed="rId15" cstate="print">
+                      <a:extLst>
+                        <a:ext uri="{28A0092B-C50C-407E-A947-70E740481C1C}">
+                          <a14:useLocalDpi xmlns:a14="http://schemas.microsoft.com/office/drawing/2010/main" val="0"/>
+                        </a:ext>
+                      </a:extLst>
+                    </a:blip>
                     <a:stretch>
                       <a:fillRect/>
                     </a:stretch>
@@ -2396,7 +2666,7 @@
                   <pic:spPr>
                     <a:xfrm>
                       <a:off x="0" y="0"/>
-                      <a:ext cx="5400040" cy="1703070"/>
+                      <a:ext cx="5955169" cy="1596451"/>
                     </a:xfrm>
                     <a:prstGeom prst="rect">
                       <a:avLst/>
@@ -2411,6 +2681,34 @@
     </w:p>
     <w:p>
       <w:pPr>
+        <w:pStyle w:val="Legenda"/>
+        <w:jc w:val="center"/>
+        <w:rPr>
+          <w:rFonts w:ascii="Arial" w:hAnsi="Arial" w:cs="Arial"/>
+        </w:rPr>
+      </w:pPr>
+      <w:r>
+        <w:t xml:space="preserve">Figura </w:t>
+      </w:r>
+      <w:fldSimple w:instr=" SEQ Figura \* ARABIC ">
+        <w:r>
+          <w:rPr>
+            <w:noProof/>
+          </w:rPr>
+          <w:t>6</w:t>
+        </w:r>
+      </w:fldSimple>
+      <w:r>
+        <w:t xml:space="preserve"> - Código-fonte do Design </w:t>
+      </w:r>
+      <w:proofErr w:type="spellStart"/>
+      <w:r>
+        <w:t>Source</w:t>
+      </w:r>
+      <w:proofErr w:type="spellEnd"/>
+    </w:p>
+    <w:p>
+      <w:pPr>
         <w:jc w:val="both"/>
         <w:rPr>
           <w:rFonts w:ascii="Arial" w:hAnsi="Arial" w:cs="Arial"/>
@@ -2429,13 +2727,7 @@
         <w:rPr>
           <w:rFonts w:ascii="Arial" w:hAnsi="Arial" w:cs="Arial"/>
         </w:rPr>
-        <w:t>Clicando duas vezes no arquivo d</w:t>
-      </w:r>
-      <w:r>
-        <w:rPr>
-          <w:rFonts w:ascii="Arial" w:hAnsi="Arial" w:cs="Arial"/>
-        </w:rPr>
-        <w:t xml:space="preserve">e </w:t>
+        <w:t xml:space="preserve">Clicando duas vezes no arquivo de </w:t>
       </w:r>
       <w:proofErr w:type="spellStart"/>
       <w:r>
@@ -2467,7 +2759,14 @@
         <w:rPr>
           <w:rFonts w:ascii="Arial" w:hAnsi="Arial" w:cs="Arial"/>
         </w:rPr>
-        <w:t xml:space="preserve"> a relação de </w:t>
+        <w:t xml:space="preserve"> </w:t>
+      </w:r>
+      <w:r>
+        <w:rPr>
+          <w:rFonts w:ascii="Arial" w:hAnsi="Arial" w:cs="Arial"/>
+        </w:rPr>
+        <w:lastRenderedPageBreak/>
+        <w:t xml:space="preserve">a relação de </w:t>
       </w:r>
       <w:r>
         <w:rPr>
@@ -2515,19 +2814,19 @@
         <w:rPr>
           <w:rFonts w:ascii="Arial" w:hAnsi="Arial" w:cs="Arial"/>
         </w:rPr>
-        <w:t>digitais (os LEDs), saída</w:t>
-      </w:r>
-      <w:r>
-        <w:rPr>
-          <w:rFonts w:ascii="Arial" w:hAnsi="Arial" w:cs="Arial"/>
-        </w:rPr>
-        <w:t xml:space="preserve"> analógica (para visualização por meio do osciloscópio)</w:t>
-      </w:r>
-      <w:r>
-        <w:rPr>
-          <w:rFonts w:ascii="Arial" w:hAnsi="Arial" w:cs="Arial"/>
-        </w:rPr>
-        <w:t xml:space="preserve"> e o </w:t>
+        <w:t>digitais (os LEDs)</w:t>
+      </w:r>
+      <w:r>
+        <w:rPr>
+          <w:rFonts w:ascii="Arial" w:hAnsi="Arial" w:cs="Arial"/>
+        </w:rPr>
+        <w:t xml:space="preserve"> </w:t>
+      </w:r>
+      <w:r>
+        <w:rPr>
+          <w:rFonts w:ascii="Arial" w:hAnsi="Arial" w:cs="Arial"/>
+        </w:rPr>
+        <w:t xml:space="preserve">e o </w:t>
       </w:r>
       <w:proofErr w:type="spellStart"/>
       <w:r>
@@ -2546,14 +2845,13 @@
     </w:p>
     <w:p>
       <w:pPr>
-        <w:jc w:val="both"/>
-        <w:rPr>
-          <w:rFonts w:ascii="Arial" w:hAnsi="Arial" w:cs="Arial"/>
-        </w:rPr>
-      </w:pPr>
-      <w:r>
-        <w:rPr>
-          <w:rFonts w:ascii="Arial" w:hAnsi="Arial" w:cs="Arial"/>
+        <w:keepNext/>
+        <w:jc w:val="center"/>
+      </w:pPr>
+      <w:r>
+        <w:rPr>
+          <w:rFonts w:ascii="Arial" w:hAnsi="Arial" w:cs="Arial"/>
+          <w:noProof/>
         </w:rPr>
         <w:drawing>
           <wp:inline distT="0" distB="0" distL="0" distR="0" wp14:anchorId="770872BE" wp14:editId="72FB4533">
@@ -2571,7 +2869,7 @@
                     <pic:cNvPicPr/>
                   </pic:nvPicPr>
                   <pic:blipFill>
-                    <a:blip r:embed="rId15"/>
+                    <a:blip r:embed="rId16"/>
                     <a:stretch>
                       <a:fillRect/>
                     </a:stretch>
@@ -2594,6 +2892,37 @@
     </w:p>
     <w:p>
       <w:pPr>
+        <w:pStyle w:val="Legenda"/>
+        <w:jc w:val="center"/>
+        <w:rPr>
+          <w:rFonts w:ascii="Arial" w:hAnsi="Arial" w:cs="Arial"/>
+        </w:rPr>
+      </w:pPr>
+      <w:r>
+        <w:t xml:space="preserve">Figura </w:t>
+      </w:r>
+      <w:fldSimple w:instr=" SEQ Figura \* ARABIC ">
+        <w:r>
+          <w:rPr>
+            <w:noProof/>
+          </w:rPr>
+          <w:t>7</w:t>
+        </w:r>
+      </w:fldSimple>
+      <w:r>
+        <w:t xml:space="preserve"> - Parte do código das </w:t>
+      </w:r>
+      <w:proofErr w:type="spellStart"/>
+      <w:r>
+        <w:t>constraints</w:t>
+      </w:r>
+      <w:proofErr w:type="spellEnd"/>
+      <w:r>
+        <w:t xml:space="preserve"> do circuito</w:t>
+      </w:r>
+    </w:p>
+    <w:p>
+      <w:pPr>
         <w:ind w:firstLine="567"/>
         <w:jc w:val="both"/>
         <w:rPr>
@@ -2604,7 +2933,6 @@
         <w:rPr>
           <w:rFonts w:ascii="Arial" w:hAnsi="Arial" w:cs="Arial"/>
         </w:rPr>
-        <w:lastRenderedPageBreak/>
         <w:t xml:space="preserve">Clicando duas vezes no arquivo do </w:t>
       </w:r>
       <w:proofErr w:type="spellStart"/>
@@ -2646,11 +2974,12 @@
       <w:r>
         <w:rPr>
           <w:rFonts w:ascii="Arial" w:hAnsi="Arial" w:cs="Arial"/>
+          <w:noProof/>
         </w:rPr>
         <w:drawing>
-          <wp:inline distT="0" distB="0" distL="0" distR="0" wp14:anchorId="6DC1CD1F" wp14:editId="14EFCC6B">
-            <wp:extent cx="5400040" cy="2211070"/>
-            <wp:effectExtent l="0" t="0" r="0" b="0"/>
+          <wp:inline distT="0" distB="0" distL="0" distR="0" wp14:anchorId="6DC1CD1F" wp14:editId="26F22644">
+            <wp:extent cx="5400040" cy="1915198"/>
+            <wp:effectExtent l="0" t="0" r="0" b="8890"/>
             <wp:docPr id="897763116" name="Imagem 1"/>
             <wp:cNvGraphicFramePr>
               <a:graphicFrameLocks xmlns:a="http://schemas.openxmlformats.org/drawingml/2006/main" noChangeAspect="1"/>
@@ -2659,11 +2988,17 @@
               <a:graphicData uri="http://schemas.openxmlformats.org/drawingml/2006/picture">
                 <pic:pic xmlns:pic="http://schemas.openxmlformats.org/drawingml/2006/picture">
                   <pic:nvPicPr>
-                    <pic:cNvPr id="897763116" name=""/>
+                    <pic:cNvPr id="897763116" name="Imagem 1"/>
                     <pic:cNvPicPr/>
                   </pic:nvPicPr>
                   <pic:blipFill>
-                    <a:blip r:embed="rId16"/>
+                    <a:blip r:embed="rId17" cstate="print">
+                      <a:extLst>
+                        <a:ext uri="{28A0092B-C50C-407E-A947-70E740481C1C}">
+                          <a14:useLocalDpi xmlns:a14="http://schemas.microsoft.com/office/drawing/2010/main" val="0"/>
+                        </a:ext>
+                      </a:extLst>
+                    </a:blip>
                     <a:stretch>
                       <a:fillRect/>
                     </a:stretch>
@@ -2671,7 +3006,7 @@
                   <pic:spPr>
                     <a:xfrm>
                       <a:off x="0" y="0"/>
-                      <a:ext cx="5400040" cy="2211070"/>
+                      <a:ext cx="5400040" cy="1915198"/>
                     </a:xfrm>
                     <a:prstGeom prst="rect">
                       <a:avLst/>
@@ -2686,19 +3021,18 @@
     </w:p>
     <w:p>
       <w:pPr>
+        <w:keepNext/>
         <w:jc w:val="both"/>
-        <w:rPr>
-          <w:rFonts w:ascii="Arial" w:hAnsi="Arial" w:cs="Arial"/>
-        </w:rPr>
-      </w:pPr>
-      <w:r>
-        <w:rPr>
-          <w:rFonts w:ascii="Arial" w:hAnsi="Arial" w:cs="Arial"/>
+      </w:pPr>
+      <w:r>
+        <w:rPr>
+          <w:rFonts w:ascii="Arial" w:hAnsi="Arial" w:cs="Arial"/>
+          <w:noProof/>
         </w:rPr>
         <w:drawing>
-          <wp:inline distT="0" distB="0" distL="0" distR="0" wp14:anchorId="0AB03154" wp14:editId="32513607">
-            <wp:extent cx="5400040" cy="704215"/>
-            <wp:effectExtent l="0" t="0" r="0" b="635"/>
+          <wp:inline distT="0" distB="0" distL="0" distR="0" wp14:anchorId="0AB03154" wp14:editId="202E2FF2">
+            <wp:extent cx="5400040" cy="584343"/>
+            <wp:effectExtent l="0" t="0" r="0" b="6350"/>
             <wp:docPr id="1125606061" name="Imagem 1"/>
             <wp:cNvGraphicFramePr>
               <a:graphicFrameLocks xmlns:a="http://schemas.openxmlformats.org/drawingml/2006/main" noChangeAspect="1"/>
@@ -2707,11 +3041,17 @@
               <a:graphicData uri="http://schemas.openxmlformats.org/drawingml/2006/picture">
                 <pic:pic xmlns:pic="http://schemas.openxmlformats.org/drawingml/2006/picture">
                   <pic:nvPicPr>
-                    <pic:cNvPr id="1125606061" name=""/>
+                    <pic:cNvPr id="1125606061" name="Imagem 1"/>
                     <pic:cNvPicPr/>
                   </pic:nvPicPr>
                   <pic:blipFill>
-                    <a:blip r:embed="rId17"/>
+                    <a:blip r:embed="rId18" cstate="print">
+                      <a:extLst>
+                        <a:ext uri="{28A0092B-C50C-407E-A947-70E740481C1C}">
+                          <a14:useLocalDpi xmlns:a14="http://schemas.microsoft.com/office/drawing/2010/main" val="0"/>
+                        </a:ext>
+                      </a:extLst>
+                    </a:blip>
                     <a:stretch>
                       <a:fillRect/>
                     </a:stretch>
@@ -2719,7 +3059,7 @@
                   <pic:spPr>
                     <a:xfrm>
                       <a:off x="0" y="0"/>
-                      <a:ext cx="5400040" cy="704215"/>
+                      <a:ext cx="5400040" cy="584343"/>
                     </a:xfrm>
                     <a:prstGeom prst="rect">
                       <a:avLst/>
@@ -2734,6 +3074,61 @@
     </w:p>
     <w:p>
       <w:pPr>
+        <w:pStyle w:val="Legenda"/>
+        <w:jc w:val="center"/>
+        <w:rPr>
+          <w:rFonts w:ascii="Arial" w:hAnsi="Arial" w:cs="Arial"/>
+        </w:rPr>
+      </w:pPr>
+      <w:r>
+        <w:t xml:space="preserve">Figura </w:t>
+      </w:r>
+      <w:fldSimple w:instr=" SEQ Figura \* ARABIC ">
+        <w:r>
+          <w:rPr>
+            <w:noProof/>
+          </w:rPr>
+          <w:t>8</w:t>
+        </w:r>
+      </w:fldSimple>
+      <w:r>
+        <w:t xml:space="preserve"> - Código-fonte do </w:t>
+      </w:r>
+      <w:proofErr w:type="spellStart"/>
+      <w:r>
+        <w:t>simulation</w:t>
+      </w:r>
+      <w:proofErr w:type="spellEnd"/>
+      <w:r>
+        <w:t xml:space="preserve"> </w:t>
+      </w:r>
+      <w:proofErr w:type="spellStart"/>
+      <w:r>
+        <w:t>Source</w:t>
+      </w:r>
+      <w:proofErr w:type="spellEnd"/>
+      <w:r>
+        <w:t xml:space="preserve"> do circuito</w:t>
+      </w:r>
+    </w:p>
+    <w:p>
+      <w:pPr>
+        <w:jc w:val="both"/>
+        <w:rPr>
+          <w:rFonts w:ascii="Arial" w:hAnsi="Arial" w:cs="Arial"/>
+        </w:rPr>
+      </w:pPr>
+    </w:p>
+    <w:p>
+      <w:pPr>
+        <w:jc w:val="both"/>
+        <w:rPr>
+          <w:rFonts w:ascii="Arial" w:hAnsi="Arial" w:cs="Arial"/>
+        </w:rPr>
+      </w:pPr>
+    </w:p>
+    <w:p>
+      <w:pPr>
         <w:jc w:val="both"/>
         <w:rPr>
           <w:rFonts w:ascii="Arial" w:hAnsi="Arial" w:cs="Arial"/>
@@ -2759,6 +3154,7 @@
           <w:sz w:val="28"/>
           <w:szCs w:val="28"/>
         </w:rPr>
+        <w:lastRenderedPageBreak/>
         <w:t>4</w:t>
       </w:r>
       <w:r>
@@ -2808,7 +3204,7 @@
         <w:rPr>
           <w:rFonts w:ascii="Arial" w:hAnsi="Arial" w:cs="Arial"/>
         </w:rPr>
-        <w:t xml:space="preserve"> do Vivado, alguns ajustes são podem ser necessários.</w:t>
+        <w:t xml:space="preserve"> do Vivado, alguns ajustes podem ser necessários.</w:t>
       </w:r>
       <w:r>
         <w:rPr>
@@ -2846,13 +3242,37 @@
         <w:rPr>
           <w:rFonts w:ascii="Arial" w:hAnsi="Arial" w:cs="Arial"/>
         </w:rPr>
-        <w:t>os bits de dados que serão transmitidos (sempre 16 ao todo), modifique as variáveis das linhas 10, 11 e 1</w:t>
-      </w:r>
-      <w:r>
-        <w:rPr>
-          <w:rFonts w:ascii="Arial" w:hAnsi="Arial" w:cs="Arial"/>
-        </w:rPr>
-        <w:t>7 respectivamente</w:t>
+        <w:t>o conjunto de</w:t>
+      </w:r>
+      <w:r>
+        <w:rPr>
+          <w:rFonts w:ascii="Arial" w:hAnsi="Arial" w:cs="Arial"/>
+        </w:rPr>
+        <w:t xml:space="preserve"> bits de dados que serão transmitidos (</w:t>
+      </w:r>
+      <w:r>
+        <w:rPr>
+          <w:rFonts w:ascii="Arial" w:hAnsi="Arial" w:cs="Arial"/>
+        </w:rPr>
+        <w:t>sempre 16 bits</w:t>
+      </w:r>
+      <w:r>
+        <w:rPr>
+          <w:rFonts w:ascii="Arial" w:hAnsi="Arial" w:cs="Arial"/>
+        </w:rPr>
+        <w:t>), modifique as variáveis das linhas 10, 11 e 1</w:t>
+      </w:r>
+      <w:r>
+        <w:rPr>
+          <w:rFonts w:ascii="Arial" w:hAnsi="Arial" w:cs="Arial"/>
+        </w:rPr>
+        <w:t>6</w:t>
+      </w:r>
+      <w:r>
+        <w:rPr>
+          <w:rFonts w:ascii="Arial" w:hAnsi="Arial" w:cs="Arial"/>
+        </w:rPr>
+        <w:t xml:space="preserve"> respectivamente</w:t>
       </w:r>
       <w:r>
         <w:rPr>
@@ -2891,19 +3311,18 @@
     </w:p>
     <w:p>
       <w:pPr>
+        <w:keepNext/>
         <w:jc w:val="both"/>
-        <w:rPr>
-          <w:rFonts w:ascii="Arial" w:hAnsi="Arial" w:cs="Arial"/>
-        </w:rPr>
-      </w:pPr>
-      <w:r>
-        <w:rPr>
-          <w:rFonts w:ascii="Arial" w:hAnsi="Arial" w:cs="Arial"/>
+      </w:pPr>
+      <w:r>
+        <w:rPr>
+          <w:rFonts w:ascii="Arial" w:hAnsi="Arial" w:cs="Arial"/>
+          <w:noProof/>
         </w:rPr>
         <w:drawing>
-          <wp:inline distT="0" distB="0" distL="0" distR="0" wp14:anchorId="7F10313B" wp14:editId="2B525545">
-            <wp:extent cx="5400040" cy="829310"/>
-            <wp:effectExtent l="0" t="0" r="0" b="8890"/>
+          <wp:inline distT="0" distB="0" distL="0" distR="0" wp14:anchorId="7F10313B" wp14:editId="31965869">
+            <wp:extent cx="5400040" cy="613439"/>
+            <wp:effectExtent l="0" t="0" r="0" b="0"/>
             <wp:docPr id="257523725" name="Imagem 1"/>
             <wp:cNvGraphicFramePr>
               <a:graphicFrameLocks xmlns:a="http://schemas.openxmlformats.org/drawingml/2006/main" noChangeAspect="1"/>
@@ -2912,11 +3331,17 @@
               <a:graphicData uri="http://schemas.openxmlformats.org/drawingml/2006/picture">
                 <pic:pic xmlns:pic="http://schemas.openxmlformats.org/drawingml/2006/picture">
                   <pic:nvPicPr>
-                    <pic:cNvPr id="257523725" name=""/>
+                    <pic:cNvPr id="257523725" name="Imagem 1"/>
                     <pic:cNvPicPr/>
                   </pic:nvPicPr>
                   <pic:blipFill>
-                    <a:blip r:embed="rId18"/>
+                    <a:blip r:embed="rId19" cstate="print">
+                      <a:extLst>
+                        <a:ext uri="{28A0092B-C50C-407E-A947-70E740481C1C}">
+                          <a14:useLocalDpi xmlns:a14="http://schemas.microsoft.com/office/drawing/2010/main" val="0"/>
+                        </a:ext>
+                      </a:extLst>
+                    </a:blip>
                     <a:stretch>
                       <a:fillRect/>
                     </a:stretch>
@@ -2924,7 +3349,7 @@
                   <pic:spPr>
                     <a:xfrm>
                       <a:off x="0" y="0"/>
-                      <a:ext cx="5400040" cy="829310"/>
+                      <a:ext cx="5400040" cy="613439"/>
                     </a:xfrm>
                     <a:prstGeom prst="rect">
                       <a:avLst/>
@@ -2939,6 +3364,50 @@
     </w:p>
     <w:p>
       <w:pPr>
+        <w:pStyle w:val="Legenda"/>
+        <w:jc w:val="center"/>
+        <w:rPr>
+          <w:rFonts w:ascii="Arial" w:hAnsi="Arial" w:cs="Arial"/>
+        </w:rPr>
+      </w:pPr>
+      <w:r>
+        <w:t xml:space="preserve">Figura </w:t>
+      </w:r>
+      <w:fldSimple w:instr=" SEQ Figura \* ARABIC ">
+        <w:r>
+          <w:rPr>
+            <w:noProof/>
+          </w:rPr>
+          <w:t>9</w:t>
+        </w:r>
+      </w:fldSimple>
+      <w:r>
+        <w:t xml:space="preserve"> - Ajuste de parâmetros no </w:t>
+      </w:r>
+      <w:proofErr w:type="spellStart"/>
+      <w:r>
+        <w:t>simulation</w:t>
+      </w:r>
+      <w:proofErr w:type="spellEnd"/>
+      <w:r>
+        <w:t xml:space="preserve"> </w:t>
+      </w:r>
+      <w:proofErr w:type="spellStart"/>
+      <w:r>
+        <w:t>source</w:t>
+      </w:r>
+      <w:proofErr w:type="spellEnd"/>
+    </w:p>
+    <w:p>
+      <w:pPr>
+        <w:jc w:val="both"/>
+        <w:rPr>
+          <w:rFonts w:ascii="Arial" w:hAnsi="Arial" w:cs="Arial"/>
+        </w:rPr>
+      </w:pPr>
+    </w:p>
+    <w:p>
+      <w:pPr>
         <w:ind w:firstLine="567"/>
         <w:jc w:val="both"/>
         <w:rPr>
@@ -2978,16 +3447,14 @@
     </w:p>
     <w:p>
       <w:pPr>
+        <w:keepNext/>
         <w:jc w:val="both"/>
-        <w:rPr>
-          <w:rFonts w:ascii="Arial" w:hAnsi="Arial" w:cs="Arial"/>
-        </w:rPr>
-      </w:pPr>
-      <w:r>
-        <w:rPr>
-          <w:rFonts w:ascii="Arial" w:hAnsi="Arial" w:cs="Arial"/>
-        </w:rPr>
-        <w:lastRenderedPageBreak/>
+      </w:pPr>
+      <w:r>
+        <w:rPr>
+          <w:rFonts w:ascii="Arial" w:hAnsi="Arial" w:cs="Arial"/>
+          <w:noProof/>
+        </w:rPr>
         <w:drawing>
           <wp:inline distT="0" distB="0" distL="0" distR="0" wp14:anchorId="33A405F1" wp14:editId="320ABAD1">
             <wp:extent cx="5400040" cy="2940050"/>
@@ -3006,7 +3473,7 @@
                     </pic:cNvPicPr>
                   </pic:nvPicPr>
                   <pic:blipFill>
-                    <a:blip r:embed="rId19">
+                    <a:blip r:embed="rId20">
                       <a:extLst>
                         <a:ext uri="{28A0092B-C50C-407E-A947-70E740481C1C}">
                           <a14:useLocalDpi xmlns:a14="http://schemas.microsoft.com/office/drawing/2010/main" val="0"/>
@@ -3037,6 +3504,39 @@
           </wp:inline>
         </w:drawing>
       </w:r>
+    </w:p>
+    <w:p>
+      <w:pPr>
+        <w:pStyle w:val="Legenda"/>
+        <w:jc w:val="center"/>
+      </w:pPr>
+      <w:r>
+        <w:t xml:space="preserve">Figura </w:t>
+      </w:r>
+      <w:fldSimple w:instr=" SEQ Figura \* ARABIC ">
+        <w:r>
+          <w:rPr>
+            <w:noProof/>
+          </w:rPr>
+          <w:t>10</w:t>
+        </w:r>
+      </w:fldSimple>
+      <w:r>
+        <w:t xml:space="preserve"> - Execução da simulação via </w:t>
+      </w:r>
+      <w:proofErr w:type="spellStart"/>
+      <w:r>
+        <w:t>testbench</w:t>
+      </w:r>
+      <w:proofErr w:type="spellEnd"/>
+    </w:p>
+    <w:p>
+      <w:pPr>
+        <w:jc w:val="both"/>
+        <w:rPr>
+          <w:rFonts w:ascii="Arial" w:hAnsi="Arial" w:cs="Arial"/>
+        </w:rPr>
+      </w:pPr>
       <w:r>
         <w:rPr>
           <w:rFonts w:ascii="Arial" w:hAnsi="Arial" w:cs="Arial"/>
@@ -3056,7 +3556,19 @@
         <w:rPr>
           <w:rFonts w:ascii="Arial" w:hAnsi="Arial" w:cs="Arial"/>
         </w:rPr>
-        <w:t>Após isso, será aberta a tela do simulador. Para facilitar a visualização do pulso, resete a simulação clicando em </w:t>
+        <w:t>Após isso, será aberta a tela do simulador. Para facilitar a visualização do pulso, </w:t>
+      </w:r>
+      <w:r>
+        <w:rPr>
+          <w:rFonts w:ascii="Arial" w:hAnsi="Arial" w:cs="Arial"/>
+        </w:rPr>
+        <w:t xml:space="preserve">seguindo a imagem abaixo, </w:t>
+      </w:r>
+      <w:r>
+        <w:rPr>
+          <w:rFonts w:ascii="Arial" w:hAnsi="Arial" w:cs="Arial"/>
+        </w:rPr>
+        <w:t>resete a simulação clicando em </w:t>
       </w:r>
       <w:proofErr w:type="spellStart"/>
       <w:r>
@@ -3098,24 +3610,35 @@
         <w:rPr>
           <w:rFonts w:ascii="Arial" w:hAnsi="Arial" w:cs="Arial"/>
         </w:rPr>
-        <w:t> for” (vermelho) e clique em Zoom Fit (roxo) Em seguida, clique em “Zoom In” (amarelo) o quanto for necessário, para se aproximar mais do pulso.</w:t>
-      </w:r>
-    </w:p>
-    <w:p>
-      <w:pPr>
+        <w:t> for” (vermelho) e clique em Zoom Fit (roxo)</w:t>
+      </w:r>
+      <w:r>
+        <w:rPr>
+          <w:rFonts w:ascii="Arial" w:hAnsi="Arial" w:cs="Arial"/>
+        </w:rPr>
+        <w:t>.</w:t>
+      </w:r>
+      <w:r>
+        <w:rPr>
+          <w:rFonts w:ascii="Arial" w:hAnsi="Arial" w:cs="Arial"/>
+        </w:rPr>
+        <w:t> Em seguida, clique em “Zoom In” (amarelo) o quanto for necessário, para se aproximar mais do pulso.</w:t>
+      </w:r>
+    </w:p>
+    <w:p>
+      <w:pPr>
+        <w:keepNext/>
         <w:jc w:val="both"/>
-        <w:rPr>
-          <w:rFonts w:ascii="Arial" w:hAnsi="Arial" w:cs="Arial"/>
-        </w:rPr>
       </w:pPr>
       <w:r>
         <w:rPr>
           <w:noProof/>
         </w:rPr>
+        <w:lastRenderedPageBreak/>
         <w:drawing>
-          <wp:inline distT="0" distB="0" distL="0" distR="0" wp14:anchorId="2E6EDD07" wp14:editId="04DCA91B">
-            <wp:extent cx="5400040" cy="2901950"/>
-            <wp:effectExtent l="0" t="0" r="0" b="0"/>
+          <wp:inline distT="0" distB="0" distL="0" distR="0" wp14:anchorId="2E6EDD07" wp14:editId="62354B4B">
+            <wp:extent cx="5400040" cy="2200979"/>
+            <wp:effectExtent l="0" t="0" r="0" b="8890"/>
             <wp:docPr id="213089011" name="Imagem 8"/>
             <wp:cNvGraphicFramePr>
               <a:graphicFrameLocks xmlns:a="http://schemas.openxmlformats.org/drawingml/2006/main" noChangeAspect="1"/>
@@ -3124,20 +3647,19 @@
               <a:graphicData uri="http://schemas.openxmlformats.org/drawingml/2006/picture">
                 <pic:pic xmlns:pic="http://schemas.openxmlformats.org/drawingml/2006/picture">
                   <pic:nvPicPr>
-                    <pic:cNvPr id="0" name="Picture 8"/>
+                    <pic:cNvPr id="213089011" name="Imagem 8"/>
                     <pic:cNvPicPr>
                       <a:picLocks noChangeAspect="1" noChangeArrowheads="1"/>
                     </pic:cNvPicPr>
                   </pic:nvPicPr>
                   <pic:blipFill>
-                    <a:blip r:embed="rId20">
+                    <a:blip r:embed="rId21" cstate="print">
                       <a:extLst>
                         <a:ext uri="{28A0092B-C50C-407E-A947-70E740481C1C}">
                           <a14:useLocalDpi xmlns:a14="http://schemas.microsoft.com/office/drawing/2010/main" val="0"/>
                         </a:ext>
                       </a:extLst>
                     </a:blip>
-                    <a:srcRect/>
                     <a:stretch>
                       <a:fillRect/>
                     </a:stretch>
@@ -3145,7 +3667,7 @@
                   <pic:spPr bwMode="auto">
                     <a:xfrm>
                       <a:off x="0" y="0"/>
-                      <a:ext cx="5400040" cy="2901950"/>
+                      <a:ext cx="5400040" cy="2200979"/>
                     </a:xfrm>
                     <a:prstGeom prst="rect">
                       <a:avLst/>
@@ -3164,6 +3686,35 @@
     </w:p>
     <w:p>
       <w:pPr>
+        <w:pStyle w:val="Legenda"/>
+        <w:jc w:val="center"/>
+      </w:pPr>
+      <w:r>
+        <w:t xml:space="preserve">Figura </w:t>
+      </w:r>
+      <w:fldSimple w:instr=" SEQ Figura \* ARABIC ">
+        <w:r>
+          <w:rPr>
+            <w:noProof/>
+          </w:rPr>
+          <w:t>11</w:t>
+        </w:r>
+      </w:fldSimple>
+      <w:r>
+        <w:t xml:space="preserve"> – Tela </w:t>
+      </w:r>
+      <w:proofErr w:type="spellStart"/>
+      <w:r>
+        <w:t>Waveform</w:t>
+      </w:r>
+      <w:proofErr w:type="spellEnd"/>
+      <w:r>
+        <w:t xml:space="preserve"> da simulação</w:t>
+      </w:r>
+    </w:p>
+    <w:p/>
+    <w:p>
+      <w:pPr>
         <w:ind w:firstLine="567"/>
         <w:jc w:val="both"/>
         <w:rPr>
@@ -3185,19 +3736,17 @@
     </w:p>
     <w:p>
       <w:pPr>
-        <w:jc w:val="both"/>
-        <w:rPr>
-          <w:rFonts w:ascii="Arial" w:hAnsi="Arial" w:cs="Arial"/>
-        </w:rPr>
-      </w:pPr>
-      <w:r>
-        <w:rPr>
-          <w:rFonts w:ascii="Arial" w:hAnsi="Arial" w:cs="Arial"/>
-        </w:rPr>
-        <w:lastRenderedPageBreak/>
+        <w:keepNext/>
+        <w:jc w:val="center"/>
+      </w:pPr>
+      <w:r>
+        <w:rPr>
+          <w:rFonts w:ascii="Arial" w:hAnsi="Arial" w:cs="Arial"/>
+          <w:noProof/>
+        </w:rPr>
         <w:drawing>
-          <wp:inline distT="0" distB="0" distL="0" distR="0" wp14:anchorId="73913BED" wp14:editId="4025A176">
-            <wp:extent cx="5400040" cy="1691640"/>
+          <wp:inline distT="0" distB="0" distL="0" distR="0" wp14:anchorId="73913BED" wp14:editId="05263DF6">
+            <wp:extent cx="4591594" cy="1691640"/>
             <wp:effectExtent l="0" t="0" r="0" b="3810"/>
             <wp:docPr id="1600219651" name="Imagem 1"/>
             <wp:cNvGraphicFramePr>
@@ -3207,11 +3756,17 @@
               <a:graphicData uri="http://schemas.openxmlformats.org/drawingml/2006/picture">
                 <pic:pic xmlns:pic="http://schemas.openxmlformats.org/drawingml/2006/picture">
                   <pic:nvPicPr>
-                    <pic:cNvPr id="1600219651" name=""/>
+                    <pic:cNvPr id="1600219651" name="Imagem 1"/>
                     <pic:cNvPicPr/>
                   </pic:nvPicPr>
                   <pic:blipFill>
-                    <a:blip r:embed="rId21"/>
+                    <a:blip r:embed="rId22" cstate="print">
+                      <a:extLst>
+                        <a:ext uri="{28A0092B-C50C-407E-A947-70E740481C1C}">
+                          <a14:useLocalDpi xmlns:a14="http://schemas.microsoft.com/office/drawing/2010/main" val="0"/>
+                        </a:ext>
+                      </a:extLst>
+                    </a:blip>
                     <a:stretch>
                       <a:fillRect/>
                     </a:stretch>
@@ -3219,7 +3774,7 @@
                   <pic:spPr>
                     <a:xfrm>
                       <a:off x="0" y="0"/>
-                      <a:ext cx="5400040" cy="1691640"/>
+                      <a:ext cx="4591594" cy="1691640"/>
                     </a:xfrm>
                     <a:prstGeom prst="rect">
                       <a:avLst/>
@@ -3230,6 +3785,37 @@
             </a:graphic>
           </wp:inline>
         </w:drawing>
+      </w:r>
+    </w:p>
+    <w:p>
+      <w:pPr>
+        <w:pStyle w:val="Legenda"/>
+        <w:jc w:val="center"/>
+        <w:rPr>
+          <w:rFonts w:ascii="Arial" w:hAnsi="Arial" w:cs="Arial"/>
+        </w:rPr>
+      </w:pPr>
+      <w:r>
+        <w:t xml:space="preserve">Figura </w:t>
+      </w:r>
+      <w:fldSimple w:instr=" SEQ Figura \* ARABIC ">
+        <w:r>
+          <w:rPr>
+            <w:noProof/>
+          </w:rPr>
+          <w:t>12</w:t>
+        </w:r>
+      </w:fldSimple>
+      <w:r>
+        <w:t xml:space="preserve"> - Pulso da modulação no </w:t>
+      </w:r>
+      <w:proofErr w:type="spellStart"/>
+      <w:r>
+        <w:t>Waveform</w:t>
+      </w:r>
+      <w:proofErr w:type="spellEnd"/>
+      <w:r>
+        <w:t xml:space="preserve"> ajustado</w:t>
       </w:r>
     </w:p>
     <w:p>
@@ -3959,11 +4545,11 @@
     <w:name w:val="Normal"/>
     <w:qFormat/>
   </w:style>
-  <w:style w:type="paragraph" w:styleId="Heading1">
-    <w:name w:val="Heading 1"/>
+  <w:style w:type="paragraph" w:styleId="Ttulo1">
+    <w:name w:val="heading 1"/>
     <w:basedOn w:val="Normal"/>
     <w:next w:val="Normal"/>
-    <w:link w:val="Heading1Char"/>
+    <w:link w:val="Ttulo1Char"/>
     <w:uiPriority w:val="9"/>
     <w:qFormat/>
     <w:rsid w:val="00C10281"/>
@@ -3980,11 +4566,11 @@
       <w:szCs w:val="40"/>
     </w:rPr>
   </w:style>
-  <w:style w:type="paragraph" w:styleId="Heading2">
-    <w:name w:val="Heading 2"/>
+  <w:style w:type="paragraph" w:styleId="Ttulo2">
+    <w:name w:val="heading 2"/>
     <w:basedOn w:val="Normal"/>
     <w:next w:val="Normal"/>
-    <w:link w:val="Heading2Char"/>
+    <w:link w:val="Ttulo2Char"/>
     <w:uiPriority w:val="9"/>
     <w:semiHidden/>
     <w:unhideWhenUsed/>
@@ -4003,11 +4589,11 @@
       <w:szCs w:val="32"/>
     </w:rPr>
   </w:style>
-  <w:style w:type="paragraph" w:styleId="Heading3">
-    <w:name w:val="Heading 3"/>
+  <w:style w:type="paragraph" w:styleId="Ttulo3">
+    <w:name w:val="heading 3"/>
     <w:basedOn w:val="Normal"/>
     <w:next w:val="Normal"/>
-    <w:link w:val="Heading3Char"/>
+    <w:link w:val="Ttulo3Char"/>
     <w:uiPriority w:val="9"/>
     <w:semiHidden/>
     <w:unhideWhenUsed/>
@@ -4026,11 +4612,11 @@
       <w:szCs w:val="28"/>
     </w:rPr>
   </w:style>
-  <w:style w:type="paragraph" w:styleId="Heading4">
-    <w:name w:val="Heading 4"/>
+  <w:style w:type="paragraph" w:styleId="Ttulo4">
+    <w:name w:val="heading 4"/>
     <w:basedOn w:val="Normal"/>
     <w:next w:val="Normal"/>
-    <w:link w:val="Heading4Char"/>
+    <w:link w:val="Ttulo4Char"/>
     <w:uiPriority w:val="9"/>
     <w:semiHidden/>
     <w:unhideWhenUsed/>
@@ -4049,11 +4635,11 @@
       <w:color w:val="0F4761" w:themeColor="accent1" w:themeShade="BF"/>
     </w:rPr>
   </w:style>
-  <w:style w:type="paragraph" w:styleId="Heading5">
-    <w:name w:val="Heading 5"/>
+  <w:style w:type="paragraph" w:styleId="Ttulo5">
+    <w:name w:val="heading 5"/>
     <w:basedOn w:val="Normal"/>
     <w:next w:val="Normal"/>
-    <w:link w:val="Heading5Char"/>
+    <w:link w:val="Ttulo5Char"/>
     <w:uiPriority w:val="9"/>
     <w:semiHidden/>
     <w:unhideWhenUsed/>
@@ -4070,11 +4656,11 @@
       <w:color w:val="0F4761" w:themeColor="accent1" w:themeShade="BF"/>
     </w:rPr>
   </w:style>
-  <w:style w:type="paragraph" w:styleId="Heading6">
-    <w:name w:val="Heading 6"/>
+  <w:style w:type="paragraph" w:styleId="Ttulo6">
+    <w:name w:val="heading 6"/>
     <w:basedOn w:val="Normal"/>
     <w:next w:val="Normal"/>
-    <w:link w:val="Heading6Char"/>
+    <w:link w:val="Ttulo6Char"/>
     <w:uiPriority w:val="9"/>
     <w:semiHidden/>
     <w:unhideWhenUsed/>
@@ -4093,11 +4679,11 @@
       <w:color w:val="595959" w:themeColor="text1" w:themeTint="A6"/>
     </w:rPr>
   </w:style>
-  <w:style w:type="paragraph" w:styleId="Heading7">
-    <w:name w:val="Heading 7"/>
+  <w:style w:type="paragraph" w:styleId="Ttulo7">
+    <w:name w:val="heading 7"/>
     <w:basedOn w:val="Normal"/>
     <w:next w:val="Normal"/>
-    <w:link w:val="Heading7Char"/>
+    <w:link w:val="Ttulo7Char"/>
     <w:uiPriority w:val="9"/>
     <w:semiHidden/>
     <w:unhideWhenUsed/>
@@ -4114,11 +4700,11 @@
       <w:color w:val="595959" w:themeColor="text1" w:themeTint="A6"/>
     </w:rPr>
   </w:style>
-  <w:style w:type="paragraph" w:styleId="Heading8">
-    <w:name w:val="Heading 8"/>
+  <w:style w:type="paragraph" w:styleId="Ttulo8">
+    <w:name w:val="heading 8"/>
     <w:basedOn w:val="Normal"/>
     <w:next w:val="Normal"/>
-    <w:link w:val="Heading8Char"/>
+    <w:link w:val="Ttulo8Char"/>
     <w:uiPriority w:val="9"/>
     <w:semiHidden/>
     <w:unhideWhenUsed/>
@@ -4137,11 +4723,11 @@
       <w:color w:val="272727" w:themeColor="text1" w:themeTint="D8"/>
     </w:rPr>
   </w:style>
-  <w:style w:type="paragraph" w:styleId="Heading9">
-    <w:name w:val="Heading 9"/>
+  <w:style w:type="paragraph" w:styleId="Ttulo9">
+    <w:name w:val="heading 9"/>
     <w:basedOn w:val="Normal"/>
     <w:next w:val="Normal"/>
-    <w:link w:val="Heading9Char"/>
+    <w:link w:val="Ttulo9Char"/>
     <w:uiPriority w:val="9"/>
     <w:semiHidden/>
     <w:unhideWhenUsed/>
@@ -4158,12 +4744,34 @@
       <w:color w:val="272727" w:themeColor="text1" w:themeTint="D8"/>
     </w:rPr>
   </w:style>
-  <w:style w:type="character" w:default="1" w:styleId="DefaultParagraphFont">
+  <w:style w:type="character" w:default="1" w:styleId="Fontepargpadro">
     <w:name w:val="Default Paragraph Font"/>
     <w:uiPriority w:val="1"/>
+    <w:semiHidden/>
     <w:unhideWhenUsed/>
   </w:style>
-  <w:style w:type="table" w:default="1" w:styleId="TableNormal">
+  <w:style w:type="table" w:default="1" w:styleId="Tabelanormal">
+    <w:name w:val="Normal Table"/>
+    <w:uiPriority w:val="99"/>
+    <w:semiHidden/>
+    <w:unhideWhenUsed/>
+    <w:tblPr>
+      <w:tblInd w:w="0" w:type="dxa"/>
+      <w:tblCellMar>
+        <w:top w:w="0" w:type="dxa"/>
+        <w:left w:w="108" w:type="dxa"/>
+        <w:bottom w:w="0" w:type="dxa"/>
+        <w:right w:w="108" w:type="dxa"/>
+      </w:tblCellMar>
+    </w:tblPr>
+  </w:style>
+  <w:style w:type="numbering" w:default="1" w:styleId="Semlista">
+    <w:name w:val="No List"/>
+    <w:uiPriority w:val="99"/>
+    <w:semiHidden/>
+    <w:unhideWhenUsed/>
+  </w:style>
+  <w:style w:type="table" w:customStyle="1" w:styleId="TableNormal">
     <w:name w:val="Table Normal"/>
     <w:uiPriority w:val="99"/>
     <w:semiHidden/>
@@ -4178,16 +4786,10 @@
       </w:tblCellMar>
     </w:tblPr>
   </w:style>
-  <w:style w:type="numbering" w:default="1" w:styleId="NoList">
-    <w:name w:val="No List"/>
-    <w:uiPriority w:val="99"/>
-    <w:semiHidden/>
-    <w:unhideWhenUsed/>
-  </w:style>
-  <w:style w:type="character" w:customStyle="1" w:styleId="Heading1Char">
-    <w:name w:val="Heading 1 Char"/>
-    <w:basedOn w:val="DefaultParagraphFont"/>
-    <w:link w:val="Heading1"/>
+  <w:style w:type="character" w:customStyle="1" w:styleId="Ttulo1Char">
+    <w:name w:val="Título 1 Char"/>
+    <w:basedOn w:val="Fontepargpadro"/>
+    <w:link w:val="Ttulo1"/>
     <w:uiPriority w:val="9"/>
     <w:rsid w:val="00C10281"/>
     <w:rPr>
@@ -4197,10 +4799,10 @@
       <w:szCs w:val="40"/>
     </w:rPr>
   </w:style>
-  <w:style w:type="character" w:customStyle="1" w:styleId="Heading2Char">
-    <w:name w:val="Heading 2 Char"/>
-    <w:basedOn w:val="DefaultParagraphFont"/>
-    <w:link w:val="Heading2"/>
+  <w:style w:type="character" w:customStyle="1" w:styleId="Ttulo2Char">
+    <w:name w:val="Título 2 Char"/>
+    <w:basedOn w:val="Fontepargpadro"/>
+    <w:link w:val="Ttulo2"/>
     <w:uiPriority w:val="9"/>
     <w:semiHidden/>
     <w:rsid w:val="00C10281"/>
@@ -4211,10 +4813,10 @@
       <w:szCs w:val="32"/>
     </w:rPr>
   </w:style>
-  <w:style w:type="character" w:customStyle="1" w:styleId="Heading3Char">
-    <w:name w:val="Heading 3 Char"/>
-    <w:basedOn w:val="DefaultParagraphFont"/>
-    <w:link w:val="Heading3"/>
+  <w:style w:type="character" w:customStyle="1" w:styleId="Ttulo3Char">
+    <w:name w:val="Título 3 Char"/>
+    <w:basedOn w:val="Fontepargpadro"/>
+    <w:link w:val="Ttulo3"/>
     <w:uiPriority w:val="9"/>
     <w:semiHidden/>
     <w:rsid w:val="00C10281"/>
@@ -4225,10 +4827,10 @@
       <w:szCs w:val="28"/>
     </w:rPr>
   </w:style>
-  <w:style w:type="character" w:customStyle="1" w:styleId="Heading4Char">
-    <w:name w:val="Heading 4 Char"/>
-    <w:basedOn w:val="DefaultParagraphFont"/>
-    <w:link w:val="Heading4"/>
+  <w:style w:type="character" w:customStyle="1" w:styleId="Ttulo4Char">
+    <w:name w:val="Título 4 Char"/>
+    <w:basedOn w:val="Fontepargpadro"/>
+    <w:link w:val="Ttulo4"/>
     <w:uiPriority w:val="9"/>
     <w:semiHidden/>
     <w:rsid w:val="00C10281"/>
@@ -4239,10 +4841,10 @@
       <w:color w:val="0F4761" w:themeColor="accent1" w:themeShade="BF"/>
     </w:rPr>
   </w:style>
-  <w:style w:type="character" w:customStyle="1" w:styleId="Heading5Char">
-    <w:name w:val="Heading 5 Char"/>
-    <w:basedOn w:val="DefaultParagraphFont"/>
-    <w:link w:val="Heading5"/>
+  <w:style w:type="character" w:customStyle="1" w:styleId="Ttulo5Char">
+    <w:name w:val="Título 5 Char"/>
+    <w:basedOn w:val="Fontepargpadro"/>
+    <w:link w:val="Ttulo5"/>
     <w:uiPriority w:val="9"/>
     <w:semiHidden/>
     <w:rsid w:val="00C10281"/>
@@ -4251,10 +4853,10 @@
       <w:color w:val="0F4761" w:themeColor="accent1" w:themeShade="BF"/>
     </w:rPr>
   </w:style>
-  <w:style w:type="character" w:customStyle="1" w:styleId="Heading6Char">
-    <w:name w:val="Heading 6 Char"/>
-    <w:basedOn w:val="DefaultParagraphFont"/>
-    <w:link w:val="Heading6"/>
+  <w:style w:type="character" w:customStyle="1" w:styleId="Ttulo6Char">
+    <w:name w:val="Título 6 Char"/>
+    <w:basedOn w:val="Fontepargpadro"/>
+    <w:link w:val="Ttulo6"/>
     <w:uiPriority w:val="9"/>
     <w:semiHidden/>
     <w:rsid w:val="00C10281"/>
@@ -4265,10 +4867,10 @@
       <w:color w:val="595959" w:themeColor="text1" w:themeTint="A6"/>
     </w:rPr>
   </w:style>
-  <w:style w:type="character" w:customStyle="1" w:styleId="Heading7Char">
-    <w:name w:val="Heading 7 Char"/>
-    <w:basedOn w:val="DefaultParagraphFont"/>
-    <w:link w:val="Heading7"/>
+  <w:style w:type="character" w:customStyle="1" w:styleId="Ttulo7Char">
+    <w:name w:val="Título 7 Char"/>
+    <w:basedOn w:val="Fontepargpadro"/>
+    <w:link w:val="Ttulo7"/>
     <w:uiPriority w:val="9"/>
     <w:semiHidden/>
     <w:rsid w:val="00C10281"/>
@@ -4277,10 +4879,10 @@
       <w:color w:val="595959" w:themeColor="text1" w:themeTint="A6"/>
     </w:rPr>
   </w:style>
-  <w:style w:type="character" w:customStyle="1" w:styleId="Heading8Char">
-    <w:name w:val="Heading 8 Char"/>
-    <w:basedOn w:val="DefaultParagraphFont"/>
-    <w:link w:val="Heading8"/>
+  <w:style w:type="character" w:customStyle="1" w:styleId="Ttulo8Char">
+    <w:name w:val="Título 8 Char"/>
+    <w:basedOn w:val="Fontepargpadro"/>
+    <w:link w:val="Ttulo8"/>
     <w:uiPriority w:val="9"/>
     <w:semiHidden/>
     <w:rsid w:val="00C10281"/>
@@ -4291,10 +4893,10 @@
       <w:color w:val="272727" w:themeColor="text1" w:themeTint="D8"/>
     </w:rPr>
   </w:style>
-  <w:style w:type="character" w:customStyle="1" w:styleId="Heading9Char">
-    <w:name w:val="Heading 9 Char"/>
-    <w:basedOn w:val="DefaultParagraphFont"/>
-    <w:link w:val="Heading9"/>
+  <w:style w:type="character" w:customStyle="1" w:styleId="Ttulo9Char">
+    <w:name w:val="Título 9 Char"/>
+    <w:basedOn w:val="Fontepargpadro"/>
+    <w:link w:val="Ttulo9"/>
     <w:uiPriority w:val="9"/>
     <w:semiHidden/>
     <w:rsid w:val="00C10281"/>
@@ -4303,11 +4905,11 @@
       <w:color w:val="272727" w:themeColor="text1" w:themeTint="D8"/>
     </w:rPr>
   </w:style>
-  <w:style w:type="paragraph" w:styleId="Title">
+  <w:style w:type="paragraph" w:styleId="Ttulo">
     <w:name w:val="Title"/>
     <w:basedOn w:val="Normal"/>
     <w:next w:val="Normal"/>
-    <w:link w:val="TitleChar"/>
+    <w:link w:val="TtuloChar"/>
     <w:uiPriority w:val="10"/>
     <w:qFormat/>
     <w:rsid w:val="00C10281"/>
@@ -4323,10 +4925,10 @@
       <w:szCs w:val="56"/>
     </w:rPr>
   </w:style>
-  <w:style w:type="character" w:customStyle="1" w:styleId="TitleChar">
-    <w:name w:val="Title Char"/>
-    <w:basedOn w:val="DefaultParagraphFont"/>
-    <w:link w:val="Title"/>
+  <w:style w:type="character" w:customStyle="1" w:styleId="TtuloChar">
+    <w:name w:val="Título Char"/>
+    <w:basedOn w:val="Fontepargpadro"/>
+    <w:link w:val="Ttulo"/>
     <w:uiPriority w:val="10"/>
     <w:rsid w:val="00C10281"/>
     <w:rPr>
@@ -4337,11 +4939,11 @@
       <w:szCs w:val="56"/>
     </w:rPr>
   </w:style>
-  <w:style w:type="paragraph" w:styleId="Subtitle">
+  <w:style w:type="paragraph" w:styleId="Subttulo">
     <w:name w:val="Subtitle"/>
     <w:basedOn w:val="Normal"/>
     <w:next w:val="Normal"/>
-    <w:link w:val="SubtitleChar"/>
+    <w:link w:val="SubttuloChar"/>
     <w:uiPriority w:val="11"/>
     <w:qFormat/>
     <w:rsid w:val="00C10281"/>
@@ -4358,10 +4960,10 @@
       <w:szCs w:val="28"/>
     </w:rPr>
   </w:style>
-  <w:style w:type="character" w:customStyle="1" w:styleId="SubtitleChar">
-    <w:name w:val="Subtitle Char"/>
-    <w:basedOn w:val="DefaultParagraphFont"/>
-    <w:link w:val="Subtitle"/>
+  <w:style w:type="character" w:customStyle="1" w:styleId="SubttuloChar">
+    <w:name w:val="Subtítulo Char"/>
+    <w:basedOn w:val="Fontepargpadro"/>
+    <w:link w:val="Subttulo"/>
     <w:uiPriority w:val="11"/>
     <w:rsid w:val="00C10281"/>
     <w:rPr>
@@ -4372,11 +4974,11 @@
       <w:szCs w:val="28"/>
     </w:rPr>
   </w:style>
-  <w:style w:type="paragraph" w:styleId="Quote">
+  <w:style w:type="paragraph" w:styleId="Citao">
     <w:name w:val="Quote"/>
     <w:basedOn w:val="Normal"/>
     <w:next w:val="Normal"/>
-    <w:link w:val="QuoteChar"/>
+    <w:link w:val="CitaoChar"/>
     <w:uiPriority w:val="29"/>
     <w:qFormat/>
     <w:rsid w:val="00C10281"/>
@@ -4390,10 +4992,10 @@
       <w:color w:val="404040" w:themeColor="text1" w:themeTint="BF"/>
     </w:rPr>
   </w:style>
-  <w:style w:type="character" w:customStyle="1" w:styleId="QuoteChar">
-    <w:name w:val="Quote Char"/>
-    <w:basedOn w:val="DefaultParagraphFont"/>
-    <w:link w:val="Quote"/>
+  <w:style w:type="character" w:customStyle="1" w:styleId="CitaoChar">
+    <w:name w:val="Citação Char"/>
+    <w:basedOn w:val="Fontepargpadro"/>
+    <w:link w:val="Citao"/>
     <w:uiPriority w:val="29"/>
     <w:rsid w:val="00C10281"/>
     <w:rPr>
@@ -4402,7 +5004,7 @@
       <w:color w:val="404040" w:themeColor="text1" w:themeTint="BF"/>
     </w:rPr>
   </w:style>
-  <w:style w:type="paragraph" w:styleId="ListParagraph">
+  <w:style w:type="paragraph" w:styleId="PargrafodaLista">
     <w:name w:val="List Paragraph"/>
     <w:basedOn w:val="Normal"/>
     <w:uiPriority w:val="34"/>
@@ -4413,9 +5015,9 @@
       <w:contextualSpacing/>
     </w:pPr>
   </w:style>
-  <w:style w:type="character" w:styleId="IntenseEmphasis">
+  <w:style w:type="character" w:styleId="nfaseIntensa">
     <w:name w:val="Intense Emphasis"/>
-    <w:basedOn w:val="DefaultParagraphFont"/>
+    <w:basedOn w:val="Fontepargpadro"/>
     <w:uiPriority w:val="21"/>
     <w:qFormat/>
     <w:rsid w:val="00C10281"/>
@@ -4425,11 +5027,11 @@
       <w:color w:val="0F4761" w:themeColor="accent1" w:themeShade="BF"/>
     </w:rPr>
   </w:style>
-  <w:style w:type="paragraph" w:styleId="IntenseQuote">
+  <w:style w:type="paragraph" w:styleId="CitaoIntensa">
     <w:name w:val="Intense Quote"/>
     <w:basedOn w:val="Normal"/>
     <w:next w:val="Normal"/>
-    <w:link w:val="IntenseQuoteChar"/>
+    <w:link w:val="CitaoIntensaChar"/>
     <w:uiPriority w:val="30"/>
     <w:qFormat/>
     <w:rsid w:val="00C10281"/>
@@ -4448,10 +5050,10 @@
       <w:color w:val="0F4761" w:themeColor="accent1" w:themeShade="BF"/>
     </w:rPr>
   </w:style>
-  <w:style w:type="character" w:customStyle="1" w:styleId="IntenseQuoteChar">
-    <w:name w:val="Intense Quote Char"/>
-    <w:basedOn w:val="DefaultParagraphFont"/>
-    <w:link w:val="IntenseQuote"/>
+  <w:style w:type="character" w:customStyle="1" w:styleId="CitaoIntensaChar">
+    <w:name w:val="Citação Intensa Char"/>
+    <w:basedOn w:val="Fontepargpadro"/>
+    <w:link w:val="CitaoIntensa"/>
     <w:uiPriority w:val="30"/>
     <w:rsid w:val="00C10281"/>
     <w:rPr>
@@ -4460,9 +5062,9 @@
       <w:color w:val="0F4761" w:themeColor="accent1" w:themeShade="BF"/>
     </w:rPr>
   </w:style>
-  <w:style w:type="character" w:styleId="IntenseReference">
+  <w:style w:type="character" w:styleId="RefernciaIntensa">
     <w:name w:val="Intense Reference"/>
-    <w:basedOn w:val="DefaultParagraphFont"/>
+    <w:basedOn w:val="Fontepargpadro"/>
     <w:uiPriority w:val="32"/>
     <w:qFormat/>
     <w:rsid w:val="00C10281"/>
@@ -4476,7 +5078,7 @@
   </w:style>
   <w:style w:type="character" w:styleId="Hyperlink">
     <w:name w:val="Hyperlink"/>
-    <w:basedOn w:val="DefaultParagraphFont"/>
+    <w:basedOn w:val="Fontepargpadro"/>
     <w:uiPriority w:val="99"/>
     <w:unhideWhenUsed/>
     <w:rsid w:val="00C10281"/>
@@ -4485,9 +5087,9 @@
       <w:u w:val="single"/>
     </w:rPr>
   </w:style>
-  <w:style w:type="character" w:styleId="UnresolvedMention">
+  <w:style w:type="character" w:styleId="MenoPendente">
     <w:name w:val="Unresolved Mention"/>
-    <w:basedOn w:val="DefaultParagraphFont"/>
+    <w:basedOn w:val="Fontepargpadro"/>
     <w:uiPriority w:val="99"/>
     <w:semiHidden/>
     <w:unhideWhenUsed/>
@@ -4515,6 +5117,25 @@
         <w:insideV w:val="single" w:sz="4" w:space="0" w:color="auto"/>
       </w:tblBorders>
     </w:tblPr>
+  </w:style>
+  <w:style w:type="paragraph" w:styleId="Legenda">
+    <w:name w:val="caption"/>
+    <w:basedOn w:val="Normal"/>
+    <w:next w:val="Normal"/>
+    <w:uiPriority w:val="35"/>
+    <w:unhideWhenUsed/>
+    <w:qFormat/>
+    <w:rsid w:val="007E0A22"/>
+    <w:pPr>
+      <w:spacing w:after="200" w:line="240" w:lineRule="auto"/>
+    </w:pPr>
+    <w:rPr>
+      <w:i/>
+      <w:iCs/>
+      <w:color w:val="0E2841" w:themeColor="text2"/>
+      <w:sz w:val="18"/>
+      <w:szCs w:val="18"/>
+    </w:rPr>
   </w:style>
 </w:styles>
 </file>
@@ -4815,6 +5436,23 @@
 </file>
 
 <file path=customXml/item1.xml><?xml version="1.0" encoding="utf-8"?>
+<p:properties xmlns:p="http://schemas.microsoft.com/office/2006/metadata/properties" xmlns:xsi="http://www.w3.org/2001/XMLSchema-instance" xmlns:pc="http://schemas.microsoft.com/office/infopath/2007/PartnerControls">
+  <documentManagement>
+    <_activity xmlns="f609b76c-21df-4f0b-9ab4-c37a38bb8313" xsi:nil="true"/>
+  </documentManagement>
+</p:properties>
+</file>
+
+<file path=customXml/item2.xml><?xml version="1.0" encoding="utf-8"?>
+<?mso-contentType ?>
+<FormTemplates xmlns="http://schemas.microsoft.com/sharepoint/v3/contenttype/forms">
+  <Display>DocumentLibraryForm</Display>
+  <Edit>DocumentLibraryForm</Edit>
+  <New>DocumentLibraryForm</New>
+</FormTemplates>
+</file>
+
+<file path=customXml/item3.xml><?xml version="1.0" encoding="utf-8"?>
 <ct:contentTypeSchema xmlns:ct="http://schemas.microsoft.com/office/2006/metadata/contentType" xmlns:ma="http://schemas.microsoft.com/office/2006/metadata/properties/metaAttributes" ct:_="" ma:_="" ma:contentTypeName="Documento" ma:contentTypeID="0x010100E451312FD7D8E442B669972CB9BE1407" ma:contentTypeVersion="12" ma:contentTypeDescription="Crie um novo documento." ma:contentTypeScope="" ma:versionID="913fa27cf80d9c6ffe46b0749415cc5c">
   <xsd:schema xmlns:xsd="http://www.w3.org/2001/XMLSchema" xmlns:xs="http://www.w3.org/2001/XMLSchema" xmlns:p="http://schemas.microsoft.com/office/2006/metadata/properties" xmlns:ns3="f609b76c-21df-4f0b-9ab4-c37a38bb8313" targetNamespace="http://schemas.microsoft.com/office/2006/metadata/properties" ma:root="true" ma:fieldsID="e282c9c3c92bd945aa91a661a648aa7a" ns3:_="">
     <xsd:import namespace="f609b76c-21df-4f0b-9ab4-c37a38bb8313"/>
@@ -5008,24 +5646,25 @@
 </ct:contentTypeSchema>
 </file>
 
-<file path=customXml/item2.xml><?xml version="1.0" encoding="utf-8"?>
-<?mso-contentType ?>
-<FormTemplates xmlns="http://schemas.microsoft.com/sharepoint/v3/contenttype/forms">
-  <Display>DocumentLibraryForm</Display>
-  <Edit>DocumentLibraryForm</Edit>
-  <New>DocumentLibraryForm</New>
-</FormTemplates>
+<file path=customXml/itemProps1.xml><?xml version="1.0" encoding="utf-8"?>
+<ds:datastoreItem xmlns:ds="http://schemas.openxmlformats.org/officeDocument/2006/customXml" ds:itemID="{D73744A8-8272-4A33-97A0-82E08442620D}">
+  <ds:schemaRefs>
+    <ds:schemaRef ds:uri="http://schemas.microsoft.com/office/2006/metadata/properties"/>
+    <ds:schemaRef ds:uri="http://schemas.microsoft.com/office/infopath/2007/PartnerControls"/>
+    <ds:schemaRef ds:uri="f609b76c-21df-4f0b-9ab4-c37a38bb8313"/>
+  </ds:schemaRefs>
+</ds:datastoreItem>
 </file>
 
-<file path=customXml/item3.xml><?xml version="1.0" encoding="utf-8"?>
-<p:properties xmlns:p="http://schemas.microsoft.com/office/2006/metadata/properties" xmlns:xsi="http://www.w3.org/2001/XMLSchema-instance" xmlns:pc="http://schemas.microsoft.com/office/infopath/2007/PartnerControls">
-  <documentManagement>
-    <_activity xmlns="f609b76c-21df-4f0b-9ab4-c37a38bb8313" xsi:nil="true"/>
-  </documentManagement>
-</p:properties>
+<file path=customXml/itemProps2.xml><?xml version="1.0" encoding="utf-8"?>
+<ds:datastoreItem xmlns:ds="http://schemas.openxmlformats.org/officeDocument/2006/customXml" ds:itemID="{532E5599-74A7-460D-AF67-342EB307D002}">
+  <ds:schemaRefs>
+    <ds:schemaRef ds:uri="http://schemas.microsoft.com/sharepoint/v3/contenttype/forms"/>
+  </ds:schemaRefs>
+</ds:datastoreItem>
 </file>
 
-<file path=customXml/itemProps1.xml><?xml version="1.0" encoding="utf-8"?>
+<file path=customXml/itemProps3.xml><?xml version="1.0" encoding="utf-8"?>
 <ds:datastoreItem xmlns:ds="http://schemas.openxmlformats.org/officeDocument/2006/customXml" ds:itemID="{EA962694-1DEC-47BB-ACCF-D07D60E38B79}">
   <ds:schemaRefs>
     <ds:schemaRef ds:uri="http://schemas.microsoft.com/office/2006/metadata/contentType"/>
@@ -5041,22 +5680,4 @@
     <ds:schemaRef ds:uri="http://schemas.microsoft.com/internal/obd"/>
   </ds:schemaRefs>
 </ds:datastoreItem>
-</file>
-
-<file path=customXml/itemProps2.xml><?xml version="1.0" encoding="utf-8"?>
-<ds:datastoreItem xmlns:ds="http://schemas.openxmlformats.org/officeDocument/2006/customXml" ds:itemID="{532E5599-74A7-460D-AF67-342EB307D002}">
-  <ds:schemaRefs>
-    <ds:schemaRef ds:uri="http://schemas.microsoft.com/sharepoint/v3/contenttype/forms"/>
-  </ds:schemaRefs>
-</ds:datastoreItem>
-</file>
-
-<file path=customXml/itemProps3.xml><?xml version="1.0" encoding="utf-8"?>
-<ds:datastoreItem xmlns:ds="http://schemas.openxmlformats.org/officeDocument/2006/customXml" ds:itemID="{D73744A8-8272-4A33-97A0-82E08442620D}">
-  <ds:schemaRefs>
-    <ds:schemaRef ds:uri="http://schemas.microsoft.com/office/2006/metadata/properties"/>
-    <ds:schemaRef ds:uri="http://schemas.microsoft.com/office/infopath/2007/PartnerControls"/>
-    <ds:schemaRef ds:uri="f609b76c-21df-4f0b-9ab4-c37a38bb8313"/>
-  </ds:schemaRefs>
-</ds:datastoreItem>
 </file>
</xml_diff>

<commit_message>
fix: corrige imagem no tutorial de NRZ-L
</commit_message>
<xml_diff>
--- a/nrz_l/docs/tutorial_simulacao.docx
+++ b/nrz_l/docs/tutorial_simulacao.docx
@@ -354,7 +354,21 @@
         <w:rPr>
           <w:rFonts w:ascii="Arial" w:hAnsi="Arial" w:cs="Arial"/>
         </w:rPr>
-        <w:t xml:space="preserve">Para iniciar a simulação, é necessário que o software Vivado seja instalado, na versão 2025.2. Para obtê-lo, baixe o instalador por meio do </w:t>
+        <w:t xml:space="preserve">Para iniciar a simulação, é necessário que o </w:t>
+      </w:r>
+      <w:proofErr w:type="gramStart"/>
+      <w:r>
+        <w:rPr>
+          <w:rFonts w:ascii="Arial" w:hAnsi="Arial" w:cs="Arial"/>
+        </w:rPr>
+        <w:t>software Vivado</w:t>
+      </w:r>
+      <w:proofErr w:type="gramEnd"/>
+      <w:r>
+        <w:rPr>
+          <w:rFonts w:ascii="Arial" w:hAnsi="Arial" w:cs="Arial"/>
+        </w:rPr>
+        <w:t xml:space="preserve"> seja instalado, na versão 2025.2. Para obtê-lo, baixe o instalador por meio do </w:t>
       </w:r>
       <w:hyperlink r:id="rId8" w:history="1">
         <w:r>
@@ -709,6 +723,7 @@
       <w:r>
         <w:rPr>
           <w:rFonts w:ascii="Arial" w:hAnsi="Arial" w:cs="Arial"/>
+          <w:noProof/>
         </w:rPr>
         <w:drawing>
           <wp:inline distT="0" distB="0" distL="0" distR="0" wp14:anchorId="5CC2F7C6" wp14:editId="70004238">
@@ -1360,6 +1375,7 @@
         </w:rPr>
         <w:t xml:space="preserve">xtensão </w:t>
       </w:r>
+      <w:proofErr w:type="gramStart"/>
       <w:r>
         <w:rPr>
           <w:rFonts w:ascii="Arial" w:hAnsi="Arial" w:cs="Arial"/>
@@ -1386,6 +1402,7 @@
         <w:t>pr</w:t>
       </w:r>
       <w:proofErr w:type="spellEnd"/>
+      <w:proofErr w:type="gramEnd"/>
       <w:r>
         <w:rPr>
           <w:rFonts w:ascii="Arial" w:hAnsi="Arial" w:cs="Arial"/>
@@ -1588,9 +1605,9 @@
         </w:rPr>
         <w:lastRenderedPageBreak/>
         <w:drawing>
-          <wp:inline distT="0" distB="0" distL="0" distR="0" wp14:anchorId="65C43218" wp14:editId="687CE980">
-            <wp:extent cx="5400040" cy="2864485"/>
-            <wp:effectExtent l="0" t="0" r="0" b="0"/>
+          <wp:inline distT="0" distB="0" distL="0" distR="0" wp14:anchorId="65C43218" wp14:editId="0D3820BB">
+            <wp:extent cx="5383885" cy="2864485"/>
+            <wp:effectExtent l="0" t="0" r="7620" b="0"/>
             <wp:docPr id="616005485" name="Imagem 3">
               <a:extLst xmlns:a="http://schemas.openxmlformats.org/drawingml/2006/main">
                 <a:ext uri="{FF2B5EF4-FFF2-40B4-BE49-F238E27FC236}">
@@ -1605,11 +1622,17 @@
               <a:graphicData uri="http://schemas.openxmlformats.org/drawingml/2006/picture">
                 <pic:pic xmlns:pic="http://schemas.openxmlformats.org/drawingml/2006/picture">
                   <pic:nvPicPr>
-                    <pic:cNvPr id="820756766" name=""/>
+                    <pic:cNvPr id="616005485" name="Imagem 3"/>
                     <pic:cNvPicPr/>
                   </pic:nvPicPr>
                   <pic:blipFill>
-                    <a:blip r:embed="rId12"/>
+                    <a:blip r:embed="rId12" cstate="print">
+                      <a:extLst>
+                        <a:ext uri="{28A0092B-C50C-407E-A947-70E740481C1C}">
+                          <a14:useLocalDpi xmlns:a14="http://schemas.microsoft.com/office/drawing/2010/main" val="0"/>
+                        </a:ext>
+                      </a:extLst>
+                    </a:blip>
                     <a:stretch>
                       <a:fillRect/>
                     </a:stretch>
@@ -1617,7 +1640,7 @@
                   <pic:spPr>
                     <a:xfrm>
                       <a:off x="0" y="0"/>
-                      <a:ext cx="5400040" cy="2864485"/>
+                      <a:ext cx="5383885" cy="2864485"/>
                     </a:xfrm>
                     <a:prstGeom prst="rect">
                       <a:avLst/>
@@ -3030,7 +3053,7 @@
           <w:noProof/>
         </w:rPr>
         <w:drawing>
-          <wp:inline distT="0" distB="0" distL="0" distR="0" wp14:anchorId="0AB03154" wp14:editId="202E2FF2">
+          <wp:inline distT="0" distB="0" distL="0" distR="0" wp14:anchorId="0AB03154" wp14:editId="5FF9CCF1">
             <wp:extent cx="5400040" cy="584343"/>
             <wp:effectExtent l="0" t="0" r="0" b="6350"/>
             <wp:docPr id="1125606061" name="Imagem 1"/>
@@ -3320,7 +3343,7 @@
           <w:noProof/>
         </w:rPr>
         <w:drawing>
-          <wp:inline distT="0" distB="0" distL="0" distR="0" wp14:anchorId="7F10313B" wp14:editId="31965869">
+          <wp:inline distT="0" distB="0" distL="0" distR="0" wp14:anchorId="7F10313B" wp14:editId="088135CE">
             <wp:extent cx="5400040" cy="613439"/>
             <wp:effectExtent l="0" t="0" r="0" b="0"/>
             <wp:docPr id="257523725" name="Imagem 1"/>
@@ -5436,23 +5459,6 @@
 </file>
 
 <file path=customXml/item1.xml><?xml version="1.0" encoding="utf-8"?>
-<p:properties xmlns:p="http://schemas.microsoft.com/office/2006/metadata/properties" xmlns:xsi="http://www.w3.org/2001/XMLSchema-instance" xmlns:pc="http://schemas.microsoft.com/office/infopath/2007/PartnerControls">
-  <documentManagement>
-    <_activity xmlns="f609b76c-21df-4f0b-9ab4-c37a38bb8313" xsi:nil="true"/>
-  </documentManagement>
-</p:properties>
-</file>
-
-<file path=customXml/item2.xml><?xml version="1.0" encoding="utf-8"?>
-<?mso-contentType ?>
-<FormTemplates xmlns="http://schemas.microsoft.com/sharepoint/v3/contenttype/forms">
-  <Display>DocumentLibraryForm</Display>
-  <Edit>DocumentLibraryForm</Edit>
-  <New>DocumentLibraryForm</New>
-</FormTemplates>
-</file>
-
-<file path=customXml/item3.xml><?xml version="1.0" encoding="utf-8"?>
 <ct:contentTypeSchema xmlns:ct="http://schemas.microsoft.com/office/2006/metadata/contentType" xmlns:ma="http://schemas.microsoft.com/office/2006/metadata/properties/metaAttributes" ct:_="" ma:_="" ma:contentTypeName="Documento" ma:contentTypeID="0x010100E451312FD7D8E442B669972CB9BE1407" ma:contentTypeVersion="12" ma:contentTypeDescription="Crie um novo documento." ma:contentTypeScope="" ma:versionID="913fa27cf80d9c6ffe46b0749415cc5c">
   <xsd:schema xmlns:xsd="http://www.w3.org/2001/XMLSchema" xmlns:xs="http://www.w3.org/2001/XMLSchema" xmlns:p="http://schemas.microsoft.com/office/2006/metadata/properties" xmlns:ns3="f609b76c-21df-4f0b-9ab4-c37a38bb8313" targetNamespace="http://schemas.microsoft.com/office/2006/metadata/properties" ma:root="true" ma:fieldsID="e282c9c3c92bd945aa91a661a648aa7a" ns3:_="">
     <xsd:import namespace="f609b76c-21df-4f0b-9ab4-c37a38bb8313"/>
@@ -5646,25 +5652,24 @@
 </ct:contentTypeSchema>
 </file>
 
-<file path=customXml/itemProps1.xml><?xml version="1.0" encoding="utf-8"?>
-<ds:datastoreItem xmlns:ds="http://schemas.openxmlformats.org/officeDocument/2006/customXml" ds:itemID="{D73744A8-8272-4A33-97A0-82E08442620D}">
-  <ds:schemaRefs>
-    <ds:schemaRef ds:uri="http://schemas.microsoft.com/office/2006/metadata/properties"/>
-    <ds:schemaRef ds:uri="http://schemas.microsoft.com/office/infopath/2007/PartnerControls"/>
-    <ds:schemaRef ds:uri="f609b76c-21df-4f0b-9ab4-c37a38bb8313"/>
-  </ds:schemaRefs>
-</ds:datastoreItem>
+<file path=customXml/item2.xml><?xml version="1.0" encoding="utf-8"?>
+<?mso-contentType ?>
+<FormTemplates xmlns="http://schemas.microsoft.com/sharepoint/v3/contenttype/forms">
+  <Display>DocumentLibraryForm</Display>
+  <Edit>DocumentLibraryForm</Edit>
+  <New>DocumentLibraryForm</New>
+</FormTemplates>
 </file>
 
-<file path=customXml/itemProps2.xml><?xml version="1.0" encoding="utf-8"?>
-<ds:datastoreItem xmlns:ds="http://schemas.openxmlformats.org/officeDocument/2006/customXml" ds:itemID="{532E5599-74A7-460D-AF67-342EB307D002}">
-  <ds:schemaRefs>
-    <ds:schemaRef ds:uri="http://schemas.microsoft.com/sharepoint/v3/contenttype/forms"/>
-  </ds:schemaRefs>
-</ds:datastoreItem>
+<file path=customXml/item3.xml><?xml version="1.0" encoding="utf-8"?>
+<p:properties xmlns:p="http://schemas.microsoft.com/office/2006/metadata/properties" xmlns:xsi="http://www.w3.org/2001/XMLSchema-instance" xmlns:pc="http://schemas.microsoft.com/office/infopath/2007/PartnerControls">
+  <documentManagement>
+    <_activity xmlns="f609b76c-21df-4f0b-9ab4-c37a38bb8313" xsi:nil="true"/>
+  </documentManagement>
+</p:properties>
 </file>
 
-<file path=customXml/itemProps3.xml><?xml version="1.0" encoding="utf-8"?>
+<file path=customXml/itemProps1.xml><?xml version="1.0" encoding="utf-8"?>
 <ds:datastoreItem xmlns:ds="http://schemas.openxmlformats.org/officeDocument/2006/customXml" ds:itemID="{EA962694-1DEC-47BB-ACCF-D07D60E38B79}">
   <ds:schemaRefs>
     <ds:schemaRef ds:uri="http://schemas.microsoft.com/office/2006/metadata/contentType"/>
@@ -5680,4 +5685,22 @@
     <ds:schemaRef ds:uri="http://schemas.microsoft.com/internal/obd"/>
   </ds:schemaRefs>
 </ds:datastoreItem>
+</file>
+
+<file path=customXml/itemProps2.xml><?xml version="1.0" encoding="utf-8"?>
+<ds:datastoreItem xmlns:ds="http://schemas.openxmlformats.org/officeDocument/2006/customXml" ds:itemID="{532E5599-74A7-460D-AF67-342EB307D002}">
+  <ds:schemaRefs>
+    <ds:schemaRef ds:uri="http://schemas.microsoft.com/sharepoint/v3/contenttype/forms"/>
+  </ds:schemaRefs>
+</ds:datastoreItem>
+</file>
+
+<file path=customXml/itemProps3.xml><?xml version="1.0" encoding="utf-8"?>
+<ds:datastoreItem xmlns:ds="http://schemas.openxmlformats.org/officeDocument/2006/customXml" ds:itemID="{D73744A8-8272-4A33-97A0-82E08442620D}">
+  <ds:schemaRefs>
+    <ds:schemaRef ds:uri="http://schemas.microsoft.com/office/2006/metadata/properties"/>
+    <ds:schemaRef ds:uri="http://schemas.microsoft.com/office/infopath/2007/PartnerControls"/>
+    <ds:schemaRef ds:uri="f609b76c-21df-4f0b-9ab4-c37a38bb8313"/>
+  </ds:schemaRefs>
+</ds:datastoreItem>
 </file>
</xml_diff>